<commit_message>
feat: rebuild C1800 courseware to adult-training standard
</commit_message>
<xml_diff>
--- a/courseware/Lesson Plan - C1800 AI Vibe Coding for Full Stack Web Development.docx
+++ b/courseware/Lesson Plan - C1800 AI Vibe Coding for Full Stack Web Development.docx
@@ -4,15 +4,53 @@
   <w:body>
     <w:p>
       <w:pPr>
-        <w:spacing w:before="2000"/>
+        <w:jc w:val="center"/>
+      </w:pPr>
+      <w:r>
+        <w:drawing>
+          <wp:inline xmlns:a="http://schemas.openxmlformats.org/drawingml/2006/main" xmlns:pic="http://schemas.openxmlformats.org/drawingml/2006/picture">
+            <wp:extent cx="960120" cy="960120"/>
+            <wp:docPr id="1" name="Picture 1"/>
+            <wp:cNvGraphicFramePr>
+              <a:graphicFrameLocks noChangeAspect="1"/>
+            </wp:cNvGraphicFramePr>
+            <a:graphic>
+              <a:graphicData uri="http://schemas.openxmlformats.org/drawingml/2006/picture">
+                <pic:pic>
+                  <pic:nvPicPr>
+                    <pic:cNvPr id="0" name="tertiary-infotech-logo.png"/>
+                    <pic:cNvPicPr/>
+                  </pic:nvPicPr>
+                  <pic:blipFill>
+                    <a:blip r:embed="rId9"/>
+                    <a:stretch>
+                      <a:fillRect/>
+                    </a:stretch>
+                  </pic:blipFill>
+                  <pic:spPr>
+                    <a:xfrm>
+                      <a:off x="0" y="0"/>
+                      <a:ext cx="960120" cy="960120"/>
+                    </a:xfrm>
+                    <a:prstGeom prst="rect"/>
+                  </pic:spPr>
+                </pic:pic>
+              </a:graphicData>
+            </a:graphic>
+          </wp:inline>
+        </w:drawing>
+      </w:r>
+    </w:p>
+    <w:p>
+      <w:pPr>
+        <w:spacing w:before="500"/>
         <w:jc w:val="center"/>
       </w:pPr>
       <w:r>
         <w:rPr>
-          <w:rFonts w:ascii="Arial" w:hAnsi="Arial"/>
           <w:b/>
           <w:color w:val="1F6FEB"/>
-          <w:sz w:val="56"/>
+          <w:sz w:val="58"/>
         </w:rPr>
         <w:t>AI Vibe Coding for Full Stack Web Development</w:t>
       </w:r>
@@ -27,7 +65,7 @@
           <w:color w:val="10B981"/>
           <w:sz w:val="38"/>
         </w:rPr>
-        <w:t>Lesson Plan</w:t>
+        <w:t>Lesson Plan — Agentic AI Loop Engineering</w:t>
       </w:r>
     </w:p>
     <w:p>
@@ -37,7 +75,7 @@
       <w:r>
         <w:t>Course Code: C1800</w:t>
         <w:br/>
-        <w:t>Version 1.0</w:t>
+        <w:t>Version 2.0</w:t>
         <w:br/>
         <w:t>Conducted by Tertiary Infotech Academy Pte Ltd</w:t>
         <w:br/>
@@ -74,33 +112,21 @@
         <w:tc>
           <w:tcPr>
             <w:tcW w:type="dxa" w:w="2160"/>
-            <w:vAlign w:val="center"/>
             <w:shd w:fill="1F6FEB"/>
           </w:tcPr>
           <w:p>
             <w:r>
-              <w:rPr>
-                <w:rFonts w:ascii="Arial" w:hAnsi="Arial"/>
-                <w:b/>
-                <w:sz w:val="18"/>
-              </w:rPr>
-              <w:t>Version Number</w:t>
+              <w:t>Version</w:t>
             </w:r>
           </w:p>
         </w:tc>
         <w:tc>
           <w:tcPr>
             <w:tcW w:type="dxa" w:w="2160"/>
-            <w:vAlign w:val="center"/>
             <w:shd w:fill="1F6FEB"/>
           </w:tcPr>
           <w:p>
             <w:r>
-              <w:rPr>
-                <w:rFonts w:ascii="Arial" w:hAnsi="Arial"/>
-                <w:b/>
-                <w:sz w:val="18"/>
-              </w:rPr>
               <w:t>Effective Date</w:t>
             </w:r>
           </w:p>
@@ -108,16 +134,10 @@
         <w:tc>
           <w:tcPr>
             <w:tcW w:type="dxa" w:w="2160"/>
-            <w:vAlign w:val="center"/>
             <w:shd w:fill="1F6FEB"/>
           </w:tcPr>
           <w:p>
             <w:r>
-              <w:rPr>
-                <w:rFonts w:ascii="Arial" w:hAnsi="Arial"/>
-                <w:b/>
-                <w:sz w:val="18"/>
-              </w:rPr>
               <w:t>Summary of Changes</w:t>
             </w:r>
           </w:p>
@@ -125,16 +145,10 @@
         <w:tc>
           <w:tcPr>
             <w:tcW w:type="dxa" w:w="2160"/>
-            <w:vAlign w:val="center"/>
             <w:shd w:fill="1F6FEB"/>
           </w:tcPr>
           <w:p>
             <w:r>
-              <w:rPr>
-                <w:rFonts w:ascii="Arial" w:hAnsi="Arial"/>
-                <w:b/>
-                <w:sz w:val="18"/>
-              </w:rPr>
               <w:t>Author</w:t>
             </w:r>
           </w:p>
@@ -144,15 +158,9 @@
         <w:tc>
           <w:tcPr>
             <w:tcW w:type="dxa" w:w="2160"/>
-            <w:vAlign w:val="center"/>
           </w:tcPr>
           <w:p>
             <w:r>
-              <w:rPr>
-                <w:rFonts w:ascii="Arial" w:hAnsi="Arial"/>
-                <w:b w:val="0"/>
-                <w:sz w:val="18"/>
-              </w:rPr>
               <w:t>1.0</w:t>
             </w:r>
           </w:p>
@@ -160,15 +168,51 @@
         <w:tc>
           <w:tcPr>
             <w:tcW w:type="dxa" w:w="2160"/>
-            <w:vAlign w:val="center"/>
           </w:tcPr>
           <w:p>
             <w:r>
-              <w:rPr>
-                <w:rFonts w:ascii="Arial" w:hAnsi="Arial"/>
-                <w:b w:val="0"/>
-                <w:sz w:val="18"/>
-              </w:rPr>
+              <w:t>11 July 2026</w:t>
+            </w:r>
+          </w:p>
+        </w:tc>
+        <w:tc>
+          <w:tcPr>
+            <w:tcW w:type="dxa" w:w="2160"/>
+          </w:tcPr>
+          <w:p>
+            <w:r>
+              <w:t>Initial release</w:t>
+            </w:r>
+          </w:p>
+        </w:tc>
+        <w:tc>
+          <w:tcPr>
+            <w:tcW w:type="dxa" w:w="2160"/>
+          </w:tcPr>
+          <w:p>
+            <w:r>
+              <w:t>Tertiary Infotech Academy</w:t>
+            </w:r>
+          </w:p>
+        </w:tc>
+      </w:tr>
+      <w:tr>
+        <w:tc>
+          <w:tcPr>
+            <w:tcW w:type="dxa" w:w="2160"/>
+          </w:tcPr>
+          <w:p>
+            <w:r>
+              <w:t>2.0</w:t>
+            </w:r>
+          </w:p>
+        </w:tc>
+        <w:tc>
+          <w:tcPr>
+            <w:tcW w:type="dxa" w:w="2160"/>
+          </w:tcPr>
+          <w:p>
+            <w:r>
               <w:t>2026-07-11</w:t>
             </w:r>
           </w:p>
@@ -176,31 +220,19 @@
         <w:tc>
           <w:tcPr>
             <w:tcW w:type="dxa" w:w="2160"/>
-            <w:vAlign w:val="center"/>
           </w:tcPr>
           <w:p>
             <w:r>
-              <w:rPr>
-                <w:rFonts w:ascii="Arial" w:hAnsi="Arial"/>
-                <w:b w:val="0"/>
-                <w:sz w:val="18"/>
-              </w:rPr>
-              <w:t>Initial non-WSQ courseware release</w:t>
+              <w:t>Rebuilt to 24-lab adult-training standard</w:t>
             </w:r>
           </w:p>
         </w:tc>
         <w:tc>
           <w:tcPr>
             <w:tcW w:type="dxa" w:w="2160"/>
-            <w:vAlign w:val="center"/>
           </w:tcPr>
           <w:p>
             <w:r>
-              <w:rPr>
-                <w:rFonts w:ascii="Arial" w:hAnsi="Arial"/>
-                <w:b w:val="0"/>
-                <w:sz w:val="18"/>
-              </w:rPr>
               <w:t>Tertiary Infotech Academy</w:t>
             </w:r>
           </w:p>
@@ -219,7 +251,6 @@
       <w:r>
         <w:fldChar w:fldCharType="begin"/>
         <w:instrText xml:space="preserve">TOC \o "1-3" \h \z \u</w:instrText>
-        <w:fldChar w:fldCharType="separate"/>
         <w:fldChar w:fldCharType="end"/>
       </w:r>
     </w:p>
@@ -233,12 +264,12 @@
         <w:pStyle w:val="Title"/>
       </w:pPr>
       <w:r>
-        <w:t>1. Course Overview</w:t>
+        <w:t>Course Information</w:t>
       </w:r>
     </w:p>
     <w:p>
       <w:r>
-        <w:t>Intermediate | 2 days | 15 contact hours | Hands-on instructor-led training | No formal assessment</w:t>
+        <w:t>Intermediate | 2 days | 15 instructional hours | Instructor-led demonstration, guided practice and independent challenge</w:t>
       </w:r>
     </w:p>
     <w:p>
@@ -246,7 +277,20 @@
         <w:pStyle w:val="Title"/>
       </w:pPr>
       <w:r>
-        <w:t>2. Learning Outcomes</w:t>
+        <w:t>Adult Learning Design</w:t>
+      </w:r>
+    </w:p>
+    <w:p>
+      <w:r>
+        <w:t>Each block uses activation of prior experience, concise concept input, trainer think-aloud, guided lab practice, independent boundary challenge, peer explanation and reflective checkpoint. The trainer adapts scaffolding based on observable evidence rather than pace alone.</w:t>
+      </w:r>
+    </w:p>
+    <w:p>
+      <w:pPr>
+        <w:pStyle w:val="Title"/>
+      </w:pPr>
+      <w:r>
+        <w:t>Learning Outcomes</w:t>
       </w:r>
     </w:p>
     <w:p>
@@ -254,7 +298,7 @@
         <w:pStyle w:val="ListBullet"/>
       </w:pPr>
       <w:r>
-        <w:t>Engineer reliable agent context and prompts.</w:t>
+        <w:t>Engineer durable agent goals, context and repository instructions.</w:t>
       </w:r>
     </w:p>
     <w:p>
@@ -262,7 +306,7 @@
         <w:pStyle w:val="ListBullet"/>
       </w:pPr>
       <w:r>
-        <w:t>Build and test a typed full-stack vertical slice.</w:t>
+        <w:t>Implement and test an accessible typed full-stack application.</w:t>
       </w:r>
     </w:p>
     <w:p>
@@ -270,7 +314,7 @@
         <w:pStyle w:val="ListBullet"/>
       </w:pPr>
       <w:r>
-        <w:t>Automate production checks and delivery gates.</w:t>
+        <w:t>Automate production builds, CI/CD gates and rollback evidence.</w:t>
       </w:r>
     </w:p>
     <w:p>
@@ -278,7 +322,7 @@
         <w:pStyle w:val="ListBullet"/>
       </w:pPr>
       <w:r>
-        <w:t>Create reusable non-WSQ agent tooling and an MCP-style integration.</w:t>
+        <w:t>Create namespaced skills, hooks, subagents and secure MCP tools.</w:t>
       </w:r>
     </w:p>
     <w:p>
@@ -286,7 +330,7 @@
         <w:pStyle w:val="Title"/>
       </w:pPr>
       <w:r>
-        <w:t>3. Detailed Schedule</w:t>
+        <w:t>Detailed Schedule</w:t>
       </w:r>
     </w:p>
     <w:p>
@@ -294,7 +338,7 @@
         <w:pStyle w:val="Heading1"/>
       </w:pPr>
       <w:r>
-        <w:t>Day 1 — Principles and implementation</w:t>
+        <w:t>Day 1 — Context, architecture and implementation</w:t>
       </w:r>
     </w:p>
     <w:tbl>
@@ -313,16 +357,10 @@
         <w:tc>
           <w:tcPr>
             <w:tcW w:type="dxa" w:w="2880"/>
-            <w:vAlign w:val="center"/>
             <w:shd w:fill="1F6FEB"/>
           </w:tcPr>
           <w:p>
             <w:r>
-              <w:rPr>
-                <w:rFonts w:ascii="Arial" w:hAnsi="Arial"/>
-                <w:b/>
-                <w:sz w:val="18"/>
-              </w:rPr>
               <w:t>Time</w:t>
             </w:r>
           </w:p>
@@ -330,33 +368,21 @@
         <w:tc>
           <w:tcPr>
             <w:tcW w:type="dxa" w:w="2880"/>
-            <w:vAlign w:val="center"/>
             <w:shd w:fill="1F6FEB"/>
           </w:tcPr>
           <w:p>
             <w:r>
-              <w:rPr>
-                <w:rFonts w:ascii="Arial" w:hAnsi="Arial"/>
-                <w:b/>
-                <w:sz w:val="18"/>
-              </w:rPr>
-              <w:t>Topic / Activity</w:t>
+              <w:t>Learning Activity</w:t>
             </w:r>
           </w:p>
         </w:tc>
         <w:tc>
           <w:tcPr>
             <w:tcW w:type="dxa" w:w="2880"/>
-            <w:vAlign w:val="center"/>
             <w:shd w:fill="1F6FEB"/>
           </w:tcPr>
           <w:p>
             <w:r>
-              <w:rPr>
-                <w:rFonts w:ascii="Arial" w:hAnsi="Arial"/>
-                <w:b/>
-                <w:sz w:val="18"/>
-              </w:rPr>
               <w:t>Minutes</w:t>
             </w:r>
           </w:p>
@@ -366,15 +392,9 @@
         <w:tc>
           <w:tcPr>
             <w:tcW w:type="dxa" w:w="2880"/>
-            <w:vAlign w:val="center"/>
           </w:tcPr>
           <w:p>
             <w:r>
-              <w:rPr>
-                <w:rFonts w:ascii="Arial" w:hAnsi="Arial"/>
-                <w:b w:val="0"/>
-                <w:sz w:val="18"/>
-              </w:rPr>
               <w:t>09:30–10:00</w:t>
             </w:r>
           </w:p>
@@ -382,31 +402,19 @@
         <w:tc>
           <w:tcPr>
             <w:tcW w:type="dxa" w:w="2880"/>
-            <w:vAlign w:val="center"/>
           </w:tcPr>
           <w:p>
             <w:r>
-              <w:rPr>
-                <w:rFonts w:ascii="Arial" w:hAnsi="Arial"/>
-                <w:b w:val="0"/>
-                <w:sz w:val="18"/>
-              </w:rPr>
-              <w:t>Welcome, environment check, goals and responsible AI use</w:t>
+              <w:t>Orientation, prior-experience activation and loop demonstration</w:t>
             </w:r>
           </w:p>
         </w:tc>
         <w:tc>
           <w:tcPr>
             <w:tcW w:type="dxa" w:w="2880"/>
-            <w:vAlign w:val="center"/>
           </w:tcPr>
           <w:p>
             <w:r>
-              <w:rPr>
-                <w:rFonts w:ascii="Arial" w:hAnsi="Arial"/>
-                <w:b w:val="0"/>
-                <w:sz w:val="18"/>
-              </w:rPr>
               <w:t>30</w:t>
             </w:r>
           </w:p>
@@ -416,100 +424,29 @@
         <w:tc>
           <w:tcPr>
             <w:tcW w:type="dxa" w:w="2880"/>
-            <w:vAlign w:val="center"/>
           </w:tcPr>
           <w:p>
             <w:r>
-              <w:rPr>
-                <w:rFonts w:ascii="Arial" w:hAnsi="Arial"/>
-                <w:b w:val="0"/>
-                <w:sz w:val="18"/>
-              </w:rPr>
-              <w:t>10:00–11:00</w:t>
+              <w:t>10:00–11:15</w:t>
             </w:r>
           </w:p>
         </w:tc>
         <w:tc>
           <w:tcPr>
             <w:tcW w:type="dxa" w:w="2880"/>
-            <w:vAlign w:val="center"/>
           </w:tcPr>
           <w:p>
             <w:r>
-              <w:rPr>
-                <w:rFonts w:ascii="Arial" w:hAnsi="Arial"/>
-                <w:b w:val="0"/>
-                <w:sz w:val="18"/>
-              </w:rPr>
-              <w:t>Topic 1: vibe coding, agent tools and architecture</w:t>
+              <w:t>Topic 1 concepts + Labs 1.1–1.3</w:t>
             </w:r>
           </w:p>
         </w:tc>
         <w:tc>
           <w:tcPr>
             <w:tcW w:type="dxa" w:w="2880"/>
-            <w:vAlign w:val="center"/>
           </w:tcPr>
           <w:p>
             <w:r>
-              <w:rPr>
-                <w:rFonts w:ascii="Arial" w:hAnsi="Arial"/>
-                <w:b w:val="0"/>
-                <w:sz w:val="18"/>
-              </w:rPr>
-              <w:t>60</w:t>
-            </w:r>
-          </w:p>
-        </w:tc>
-      </w:tr>
-      <w:tr>
-        <w:tc>
-          <w:tcPr>
-            <w:tcW w:type="dxa" w:w="2880"/>
-            <w:vAlign w:val="center"/>
-            <w:shd w:fill="E8F8F1"/>
-          </w:tcPr>
-          <w:p>
-            <w:r>
-              <w:rPr>
-                <w:rFonts w:ascii="Arial" w:hAnsi="Arial"/>
-                <w:b w:val="0"/>
-                <w:sz w:val="18"/>
-              </w:rPr>
-              <w:t>11:00–12:15</w:t>
-            </w:r>
-          </w:p>
-        </w:tc>
-        <w:tc>
-          <w:tcPr>
-            <w:tcW w:type="dxa" w:w="2880"/>
-            <w:vAlign w:val="center"/>
-            <w:shd w:fill="E8F8F1"/>
-          </w:tcPr>
-          <w:p>
-            <w:r>
-              <w:rPr>
-                <w:rFonts w:ascii="Arial" w:hAnsi="Arial"/>
-                <w:b w:val="0"/>
-                <w:sz w:val="18"/>
-              </w:rPr>
-              <w:t>Lab 1: agent-ready scaffold</w:t>
-            </w:r>
-          </w:p>
-        </w:tc>
-        <w:tc>
-          <w:tcPr>
-            <w:tcW w:type="dxa" w:w="2880"/>
-            <w:vAlign w:val="center"/>
-            <w:shd w:fill="E8F8F1"/>
-          </w:tcPr>
-          <w:p>
-            <w:r>
-              <w:rPr>
-                <w:rFonts w:ascii="Arial" w:hAnsi="Arial"/>
-                <w:b w:val="0"/>
-                <w:sz w:val="18"/>
-              </w:rPr>
               <w:t>75</w:t>
             </w:r>
           </w:p>
@@ -519,51 +456,30 @@
         <w:tc>
           <w:tcPr>
             <w:tcW w:type="dxa" w:w="2880"/>
-            <w:vAlign w:val="center"/>
-            <w:shd w:fill="E8F8F1"/>
           </w:tcPr>
           <w:p>
             <w:r>
-              <w:rPr>
-                <w:rFonts w:ascii="Arial" w:hAnsi="Arial"/>
-                <w:b w:val="0"/>
-                <w:sz w:val="18"/>
-              </w:rPr>
-              <w:t>12:15–13:00</w:t>
+              <w:t>11:15–13:00</w:t>
             </w:r>
           </w:p>
         </w:tc>
         <w:tc>
           <w:tcPr>
             <w:tcW w:type="dxa" w:w="2880"/>
-            <w:vAlign w:val="center"/>
-            <w:shd w:fill="E8F8F1"/>
           </w:tcPr>
           <w:p>
             <w:r>
-              <w:rPr>
-                <w:rFonts w:ascii="Arial" w:hAnsi="Arial"/>
-                <w:b w:val="0"/>
-                <w:sz w:val="18"/>
-              </w:rPr>
-              <w:t>Lab 2: context and prompt contract, part 1</w:t>
+              <w:t>Labs 1.4–1.6: brief, instructions and scaffold</w:t>
             </w:r>
           </w:p>
         </w:tc>
         <w:tc>
           <w:tcPr>
             <w:tcW w:type="dxa" w:w="2880"/>
-            <w:vAlign w:val="center"/>
-            <w:shd w:fill="E8F8F1"/>
           </w:tcPr>
           <w:p>
             <w:r>
-              <w:rPr>
-                <w:rFonts w:ascii="Arial" w:hAnsi="Arial"/>
-                <w:b w:val="0"/>
-                <w:sz w:val="18"/>
-              </w:rPr>
-              <w:t>45</w:t>
+              <w:t>105</w:t>
             </w:r>
           </w:p>
         </w:tc>
@@ -572,16 +488,10 @@
         <w:tc>
           <w:tcPr>
             <w:tcW w:type="dxa" w:w="2880"/>
-            <w:vAlign w:val="center"/>
             <w:shd w:fill="FFF4CC"/>
           </w:tcPr>
           <w:p>
             <w:r>
-              <w:rPr>
-                <w:rFonts w:ascii="Arial" w:hAnsi="Arial"/>
-                <w:b w:val="0"/>
-                <w:sz w:val="18"/>
-              </w:rPr>
               <w:t>13:00–13:30</w:t>
             </w:r>
           </w:p>
@@ -589,16 +499,10 @@
         <w:tc>
           <w:tcPr>
             <w:tcW w:type="dxa" w:w="2880"/>
-            <w:vAlign w:val="center"/>
             <w:shd w:fill="FFF4CC"/>
           </w:tcPr>
           <w:p>
             <w:r>
-              <w:rPr>
-                <w:rFonts w:ascii="Arial" w:hAnsi="Arial"/>
-                <w:b w:val="0"/>
-                <w:sz w:val="18"/>
-              </w:rPr>
               <w:t>Lunch</w:t>
             </w:r>
           </w:p>
@@ -606,16 +510,10 @@
         <w:tc>
           <w:tcPr>
             <w:tcW w:type="dxa" w:w="2880"/>
-            <w:vAlign w:val="center"/>
             <w:shd w:fill="FFF4CC"/>
           </w:tcPr>
           <w:p>
             <w:r>
-              <w:rPr>
-                <w:rFonts w:ascii="Arial" w:hAnsi="Arial"/>
-                <w:b w:val="0"/>
-                <w:sz w:val="18"/>
-              </w:rPr>
               <w:t>30</w:t>
             </w:r>
           </w:p>
@@ -625,51 +523,30 @@
         <w:tc>
           <w:tcPr>
             <w:tcW w:type="dxa" w:w="2880"/>
-            <w:vAlign w:val="center"/>
-            <w:shd w:fill="E8F8F1"/>
           </w:tcPr>
           <w:p>
             <w:r>
-              <w:rPr>
-                <w:rFonts w:ascii="Arial" w:hAnsi="Arial"/>
-                <w:b w:val="0"/>
-                <w:sz w:val="18"/>
-              </w:rPr>
-              <w:t>13:30–14:30</w:t>
+              <w:t>13:30–15:00</w:t>
             </w:r>
           </w:p>
         </w:tc>
         <w:tc>
           <w:tcPr>
             <w:tcW w:type="dxa" w:w="2880"/>
-            <w:vAlign w:val="center"/>
-            <w:shd w:fill="E8F8F1"/>
           </w:tcPr>
           <w:p>
             <w:r>
-              <w:rPr>
-                <w:rFonts w:ascii="Arial" w:hAnsi="Arial"/>
-                <w:b w:val="0"/>
-                <w:sz w:val="18"/>
-              </w:rPr>
-              <w:t>Lab 2: vertical slice and verification</w:t>
+              <w:t>Topic 2 concepts + Labs 2.1–2.4</w:t>
             </w:r>
           </w:p>
         </w:tc>
         <w:tc>
           <w:tcPr>
             <w:tcW w:type="dxa" w:w="2880"/>
-            <w:vAlign w:val="center"/>
-            <w:shd w:fill="E8F8F1"/>
           </w:tcPr>
           <w:p>
             <w:r>
-              <w:rPr>
-                <w:rFonts w:ascii="Arial" w:hAnsi="Arial"/>
-                <w:b w:val="0"/>
-                <w:sz w:val="18"/>
-              </w:rPr>
-              <w:t>60</w:t>
+              <w:t>90</w:t>
             </w:r>
           </w:p>
         </w:tc>
@@ -678,83 +555,21 @@
         <w:tc>
           <w:tcPr>
             <w:tcW w:type="dxa" w:w="2880"/>
-            <w:vAlign w:val="center"/>
+            <w:shd w:fill="FFF4CC"/>
           </w:tcPr>
           <w:p>
             <w:r>
-              <w:rPr>
-                <w:rFonts w:ascii="Arial" w:hAnsi="Arial"/>
-                <w:b w:val="0"/>
-                <w:sz w:val="18"/>
-              </w:rPr>
-              <w:t>14:30–15:15</w:t>
+              <w:t>15:00–15:15</w:t>
             </w:r>
           </w:p>
         </w:tc>
         <w:tc>
           <w:tcPr>
             <w:tcW w:type="dxa" w:w="2880"/>
-            <w:vAlign w:val="center"/>
-          </w:tcPr>
-          <w:p>
-            <w:r>
-              <w:rPr>
-                <w:rFonts w:ascii="Arial" w:hAnsi="Arial"/>
-                <w:b w:val="0"/>
-                <w:sz w:val="18"/>
-              </w:rPr>
-              <w:t>Topic 2: frontend/backend agent workflows</w:t>
-            </w:r>
-          </w:p>
-        </w:tc>
-        <w:tc>
-          <w:tcPr>
-            <w:tcW w:type="dxa" w:w="2880"/>
-            <w:vAlign w:val="center"/>
-          </w:tcPr>
-          <w:p>
-            <w:r>
-              <w:rPr>
-                <w:rFonts w:ascii="Arial" w:hAnsi="Arial"/>
-                <w:b w:val="0"/>
-                <w:sz w:val="18"/>
-              </w:rPr>
-              <w:t>45</w:t>
-            </w:r>
-          </w:p>
-        </w:tc>
-      </w:tr>
-      <w:tr>
-        <w:tc>
-          <w:tcPr>
-            <w:tcW w:type="dxa" w:w="2880"/>
-            <w:vAlign w:val="center"/>
             <w:shd w:fill="FFF4CC"/>
           </w:tcPr>
           <w:p>
             <w:r>
-              <w:rPr>
-                <w:rFonts w:ascii="Arial" w:hAnsi="Arial"/>
-                <w:b w:val="0"/>
-                <w:sz w:val="18"/>
-              </w:rPr>
-              <w:t>15:15–15:30</w:t>
-            </w:r>
-          </w:p>
-        </w:tc>
-        <w:tc>
-          <w:tcPr>
-            <w:tcW w:type="dxa" w:w="2880"/>
-            <w:vAlign w:val="center"/>
-            <w:shd w:fill="FFF4CC"/>
-          </w:tcPr>
-          <w:p>
-            <w:r>
-              <w:rPr>
-                <w:rFonts w:ascii="Arial" w:hAnsi="Arial"/>
-                <w:b w:val="0"/>
-                <w:sz w:val="18"/>
-              </w:rPr>
               <w:t>Tea break</w:t>
             </w:r>
           </w:p>
@@ -762,16 +577,10 @@
         <w:tc>
           <w:tcPr>
             <w:tcW w:type="dxa" w:w="2880"/>
-            <w:vAlign w:val="center"/>
             <w:shd w:fill="FFF4CC"/>
           </w:tcPr>
           <w:p>
             <w:r>
-              <w:rPr>
-                <w:rFonts w:ascii="Arial" w:hAnsi="Arial"/>
-                <w:b w:val="0"/>
-                <w:sz w:val="18"/>
-              </w:rPr>
               <w:t>15</w:t>
             </w:r>
           </w:p>
@@ -781,51 +590,30 @@
         <w:tc>
           <w:tcPr>
             <w:tcW w:type="dxa" w:w="2880"/>
-            <w:vAlign w:val="center"/>
-            <w:shd w:fill="E8F8F1"/>
           </w:tcPr>
           <w:p>
             <w:r>
-              <w:rPr>
-                <w:rFonts w:ascii="Arial" w:hAnsi="Arial"/>
-                <w:b w:val="0"/>
-                <w:sz w:val="18"/>
-              </w:rPr>
-              <w:t>15:30–16:30</w:t>
+              <w:t>15:15–17:00</w:t>
             </w:r>
           </w:p>
         </w:tc>
         <w:tc>
           <w:tcPr>
             <w:tcW w:type="dxa" w:w="2880"/>
-            <w:vAlign w:val="center"/>
-            <w:shd w:fill="E8F8F1"/>
           </w:tcPr>
           <w:p>
             <w:r>
-              <w:rPr>
-                <w:rFonts w:ascii="Arial" w:hAnsi="Arial"/>
-                <w:b w:val="0"/>
-                <w:sz w:val="18"/>
-              </w:rPr>
-              <w:t>Lab 3: accessible responsive frontend</w:t>
+              <w:t>Labs 2.5–2.9: contracts, API, data and integration</w:t>
             </w:r>
           </w:p>
         </w:tc>
         <w:tc>
           <w:tcPr>
             <w:tcW w:type="dxa" w:w="2880"/>
-            <w:vAlign w:val="center"/>
-            <w:shd w:fill="E8F8F1"/>
           </w:tcPr>
           <w:p>
             <w:r>
-              <w:rPr>
-                <w:rFonts w:ascii="Arial" w:hAnsi="Arial"/>
-                <w:b w:val="0"/>
-                <w:sz w:val="18"/>
-              </w:rPr>
-              <w:t>60</w:t>
+              <w:t>105</w:t>
             </w:r>
           </w:p>
         </w:tc>
@@ -834,101 +622,30 @@
         <w:tc>
           <w:tcPr>
             <w:tcW w:type="dxa" w:w="2880"/>
-            <w:vAlign w:val="center"/>
-            <w:shd w:fill="E8F8F1"/>
           </w:tcPr>
           <w:p>
             <w:r>
-              <w:rPr>
-                <w:rFonts w:ascii="Arial" w:hAnsi="Arial"/>
-                <w:b w:val="0"/>
-                <w:sz w:val="18"/>
-              </w:rPr>
-              <w:t>16:30–17:20</w:t>
+              <w:t>17:00–17:30</w:t>
             </w:r>
           </w:p>
         </w:tc>
         <w:tc>
           <w:tcPr>
             <w:tcW w:type="dxa" w:w="2880"/>
-            <w:vAlign w:val="center"/>
-            <w:shd w:fill="E8F8F1"/>
           </w:tcPr>
           <w:p>
             <w:r>
-              <w:rPr>
-                <w:rFonts w:ascii="Arial" w:hAnsi="Arial"/>
-                <w:b w:val="0"/>
-                <w:sz w:val="18"/>
-              </w:rPr>
-              <w:t>Lab 4: API, data and integration tests</w:t>
+              <w:t>Labs 2.10–2.11, review and checkpoint</w:t>
             </w:r>
           </w:p>
         </w:tc>
         <w:tc>
           <w:tcPr>
             <w:tcW w:type="dxa" w:w="2880"/>
-            <w:vAlign w:val="center"/>
-            <w:shd w:fill="E8F8F1"/>
           </w:tcPr>
           <w:p>
             <w:r>
-              <w:rPr>
-                <w:rFonts w:ascii="Arial" w:hAnsi="Arial"/>
-                <w:b w:val="0"/>
-                <w:sz w:val="18"/>
-              </w:rPr>
-              <w:t>50</w:t>
-            </w:r>
-          </w:p>
-        </w:tc>
-      </w:tr>
-      <w:tr>
-        <w:tc>
-          <w:tcPr>
-            <w:tcW w:type="dxa" w:w="2880"/>
-            <w:vAlign w:val="center"/>
-          </w:tcPr>
-          <w:p>
-            <w:r>
-              <w:rPr>
-                <w:rFonts w:ascii="Arial" w:hAnsi="Arial"/>
-                <w:b w:val="0"/>
-                <w:sz w:val="18"/>
-              </w:rPr>
-              <w:t>17:20–17:30</w:t>
-            </w:r>
-          </w:p>
-        </w:tc>
-        <w:tc>
-          <w:tcPr>
-            <w:tcW w:type="dxa" w:w="2880"/>
-            <w:vAlign w:val="center"/>
-          </w:tcPr>
-          <w:p>
-            <w:r>
-              <w:rPr>
-                <w:rFonts w:ascii="Arial" w:hAnsi="Arial"/>
-                <w:b w:val="0"/>
-                <w:sz w:val="18"/>
-              </w:rPr>
-              <w:t>Review and checkpoint</w:t>
-            </w:r>
-          </w:p>
-        </w:tc>
-        <w:tc>
-          <w:tcPr>
-            <w:tcW w:type="dxa" w:w="2880"/>
-            <w:vAlign w:val="center"/>
-          </w:tcPr>
-          <w:p>
-            <w:r>
-              <w:rPr>
-                <w:rFonts w:ascii="Arial" w:hAnsi="Arial"/>
-                <w:b w:val="0"/>
-                <w:sz w:val="18"/>
-              </w:rPr>
-              <w:t>10</w:t>
+              <w:t>30</w:t>
             </w:r>
           </w:p>
         </w:tc>
@@ -936,7 +653,7 @@
     </w:tbl>
     <w:p>
       <w:r>
-        <w:t>Classroom window: 480 minutes; instructional/contact time excluding lunch: 450 minutes (7.5 hours).</w:t>
+        <w:t>Instructional/contact time excluding lunch: 450 minutes (7.5 hours).</w:t>
       </w:r>
     </w:p>
     <w:p>
@@ -944,7 +661,7 @@
         <w:pStyle w:val="Heading1"/>
       </w:pPr>
       <w:r>
-        <w:t>Day 2 — Delivery and orchestration</w:t>
+        <w:t>Day 2 — Delivery, reusable agents and orchestration</w:t>
       </w:r>
     </w:p>
     <w:tbl>
@@ -963,16 +680,10 @@
         <w:tc>
           <w:tcPr>
             <w:tcW w:type="dxa" w:w="2880"/>
-            <w:vAlign w:val="center"/>
             <w:shd w:fill="1F6FEB"/>
           </w:tcPr>
           <w:p>
             <w:r>
-              <w:rPr>
-                <w:rFonts w:ascii="Arial" w:hAnsi="Arial"/>
-                <w:b/>
-                <w:sz w:val="18"/>
-              </w:rPr>
               <w:t>Time</w:t>
             </w:r>
           </w:p>
@@ -980,33 +691,21 @@
         <w:tc>
           <w:tcPr>
             <w:tcW w:type="dxa" w:w="2880"/>
-            <w:vAlign w:val="center"/>
             <w:shd w:fill="1F6FEB"/>
           </w:tcPr>
           <w:p>
             <w:r>
-              <w:rPr>
-                <w:rFonts w:ascii="Arial" w:hAnsi="Arial"/>
-                <w:b/>
-                <w:sz w:val="18"/>
-              </w:rPr>
-              <w:t>Topic / Activity</w:t>
+              <w:t>Learning Activity</w:t>
             </w:r>
           </w:p>
         </w:tc>
         <w:tc>
           <w:tcPr>
             <w:tcW w:type="dxa" w:w="2880"/>
-            <w:vAlign w:val="center"/>
             <w:shd w:fill="1F6FEB"/>
           </w:tcPr>
           <w:p>
             <w:r>
-              <w:rPr>
-                <w:rFonts w:ascii="Arial" w:hAnsi="Arial"/>
-                <w:b/>
-                <w:sz w:val="18"/>
-              </w:rPr>
               <w:t>Minutes</w:t>
             </w:r>
           </w:p>
@@ -1016,15 +715,9 @@
         <w:tc>
           <w:tcPr>
             <w:tcW w:type="dxa" w:w="2880"/>
-            <w:vAlign w:val="center"/>
           </w:tcPr>
           <w:p>
             <w:r>
-              <w:rPr>
-                <w:rFonts w:ascii="Arial" w:hAnsi="Arial"/>
-                <w:b w:val="0"/>
-                <w:sz w:val="18"/>
-              </w:rPr>
               <w:t>09:30–10:00</w:t>
             </w:r>
           </w:p>
@@ -1032,31 +725,19 @@
         <w:tc>
           <w:tcPr>
             <w:tcW w:type="dxa" w:w="2880"/>
-            <w:vAlign w:val="center"/>
           </w:tcPr>
           <w:p>
             <w:r>
-              <w:rPr>
-                <w:rFonts w:ascii="Arial" w:hAnsi="Arial"/>
-                <w:b w:val="0"/>
-                <w:sz w:val="18"/>
-              </w:rPr>
-              <w:t>Recap, troubleshoot and restore checkpoint</w:t>
+              <w:t>Retrieval practice and checkpoint recovery</w:t>
             </w:r>
           </w:p>
         </w:tc>
         <w:tc>
           <w:tcPr>
             <w:tcW w:type="dxa" w:w="2880"/>
-            <w:vAlign w:val="center"/>
           </w:tcPr>
           <w:p>
             <w:r>
-              <w:rPr>
-                <w:rFonts w:ascii="Arial" w:hAnsi="Arial"/>
-                <w:b w:val="0"/>
-                <w:sz w:val="18"/>
-              </w:rPr>
               <w:t>30</w:t>
             </w:r>
           </w:p>
@@ -1066,48 +747,30 @@
         <w:tc>
           <w:tcPr>
             <w:tcW w:type="dxa" w:w="2880"/>
-            <w:vAlign w:val="center"/>
           </w:tcPr>
           <w:p>
             <w:r>
-              <w:rPr>
-                <w:rFonts w:ascii="Arial" w:hAnsi="Arial"/>
-                <w:b w:val="0"/>
-                <w:sz w:val="18"/>
-              </w:rPr>
-              <w:t>10:00–10:45</w:t>
+              <w:t>10:00–11:30</w:t>
             </w:r>
           </w:p>
         </w:tc>
         <w:tc>
           <w:tcPr>
             <w:tcW w:type="dxa" w:w="2880"/>
-            <w:vAlign w:val="center"/>
           </w:tcPr>
           <w:p>
             <w:r>
-              <w:rPr>
-                <w:rFonts w:ascii="Arial" w:hAnsi="Arial"/>
-                <w:b w:val="0"/>
-                <w:sz w:val="18"/>
-              </w:rPr>
-              <w:t>Topic 3: cloud deployment and release gates</w:t>
+              <w:t>Topic 3 concepts + Labs 3.1–3.3</w:t>
             </w:r>
           </w:p>
         </w:tc>
         <w:tc>
           <w:tcPr>
             <w:tcW w:type="dxa" w:w="2880"/>
-            <w:vAlign w:val="center"/>
           </w:tcPr>
           <w:p>
             <w:r>
-              <w:rPr>
-                <w:rFonts w:ascii="Arial" w:hAnsi="Arial"/>
-                <w:b w:val="0"/>
-                <w:sz w:val="18"/>
-              </w:rPr>
-              <w:t>45</w:t>
+              <w:t>90</w:t>
             </w:r>
           </w:p>
         </w:tc>
@@ -1116,50 +779,96 @@
         <w:tc>
           <w:tcPr>
             <w:tcW w:type="dxa" w:w="2880"/>
-            <w:vAlign w:val="center"/>
-            <w:shd w:fill="E8F8F1"/>
           </w:tcPr>
           <w:p>
             <w:r>
-              <w:rPr>
-                <w:rFonts w:ascii="Arial" w:hAnsi="Arial"/>
-                <w:b w:val="0"/>
-                <w:sz w:val="18"/>
-              </w:rPr>
-              <w:t>10:45–11:45</w:t>
+              <w:t>11:30–13:00</w:t>
             </w:r>
           </w:p>
         </w:tc>
         <w:tc>
           <w:tcPr>
             <w:tcW w:type="dxa" w:w="2880"/>
-            <w:vAlign w:val="center"/>
-            <w:shd w:fill="E8F8F1"/>
           </w:tcPr>
           <w:p>
             <w:r>
-              <w:rPr>
-                <w:rFonts w:ascii="Arial" w:hAnsi="Arial"/>
-                <w:b w:val="0"/>
-                <w:sz w:val="18"/>
-              </w:rPr>
-              <w:t>Lab 5: production build</w:t>
+              <w:t>Labs 3.4–3.5: CI and failure injection</w:t>
             </w:r>
           </w:p>
         </w:tc>
         <w:tc>
           <w:tcPr>
             <w:tcW w:type="dxa" w:w="2880"/>
-            <w:vAlign w:val="center"/>
-            <w:shd w:fill="E8F8F1"/>
           </w:tcPr>
           <w:p>
             <w:r>
-              <w:rPr>
-                <w:rFonts w:ascii="Arial" w:hAnsi="Arial"/>
-                <w:b w:val="0"/>
-                <w:sz w:val="18"/>
-              </w:rPr>
+              <w:t>90</w:t>
+            </w:r>
+          </w:p>
+        </w:tc>
+      </w:tr>
+      <w:tr>
+        <w:tc>
+          <w:tcPr>
+            <w:tcW w:type="dxa" w:w="2880"/>
+            <w:shd w:fill="FFF4CC"/>
+          </w:tcPr>
+          <w:p>
+            <w:r>
+              <w:t>13:00–13:30</w:t>
+            </w:r>
+          </w:p>
+        </w:tc>
+        <w:tc>
+          <w:tcPr>
+            <w:tcW w:type="dxa" w:w="2880"/>
+            <w:shd w:fill="FFF4CC"/>
+          </w:tcPr>
+          <w:p>
+            <w:r>
+              <w:t>Lunch</w:t>
+            </w:r>
+          </w:p>
+        </w:tc>
+        <w:tc>
+          <w:tcPr>
+            <w:tcW w:type="dxa" w:w="2880"/>
+            <w:shd w:fill="FFF4CC"/>
+          </w:tcPr>
+          <w:p>
+            <w:r>
+              <w:t>30</w:t>
+            </w:r>
+          </w:p>
+        </w:tc>
+      </w:tr>
+      <w:tr>
+        <w:tc>
+          <w:tcPr>
+            <w:tcW w:type="dxa" w:w="2880"/>
+          </w:tcPr>
+          <w:p>
+            <w:r>
+              <w:t>13:30–14:30</w:t>
+            </w:r>
+          </w:p>
+        </w:tc>
+        <w:tc>
+          <w:tcPr>
+            <w:tcW w:type="dxa" w:w="2880"/>
+          </w:tcPr>
+          <w:p>
+            <w:r>
+              <w:t>Labs 3.6–3.7: deploy, observe and roll back</w:t>
+            </w:r>
+          </w:p>
+        </w:tc>
+        <w:tc>
+          <w:tcPr>
+            <w:tcW w:type="dxa" w:w="2880"/>
+          </w:tcPr>
+          <w:p>
+            <w:r>
               <w:t>60</w:t>
             </w:r>
           </w:p>
@@ -1169,103 +878,29 @@
         <w:tc>
           <w:tcPr>
             <w:tcW w:type="dxa" w:w="2880"/>
-            <w:vAlign w:val="center"/>
-            <w:shd w:fill="E8F8F1"/>
           </w:tcPr>
           <w:p>
             <w:r>
-              <w:rPr>
-                <w:rFonts w:ascii="Arial" w:hAnsi="Arial"/>
-                <w:b w:val="0"/>
-                <w:sz w:val="18"/>
-              </w:rPr>
-              <w:t>11:45–13:00</w:t>
+              <w:t>14:30–15:00</w:t>
             </w:r>
           </w:p>
         </w:tc>
         <w:tc>
           <w:tcPr>
             <w:tcW w:type="dxa" w:w="2880"/>
-            <w:vAlign w:val="center"/>
-            <w:shd w:fill="E8F8F1"/>
           </w:tcPr>
           <w:p>
             <w:r>
-              <w:rPr>
-                <w:rFonts w:ascii="Arial" w:hAnsi="Arial"/>
-                <w:b w:val="0"/>
-                <w:sz w:val="18"/>
-              </w:rPr>
-              <w:t>Lab 6: GitHub Actions CI/CD</w:t>
+              <w:t>Topic 4 concepts and trainer MCP demonstration</w:t>
             </w:r>
           </w:p>
         </w:tc>
         <w:tc>
           <w:tcPr>
             <w:tcW w:type="dxa" w:w="2880"/>
-            <w:vAlign w:val="center"/>
-            <w:shd w:fill="E8F8F1"/>
           </w:tcPr>
           <w:p>
             <w:r>
-              <w:rPr>
-                <w:rFonts w:ascii="Arial" w:hAnsi="Arial"/>
-                <w:b w:val="0"/>
-                <w:sz w:val="18"/>
-              </w:rPr>
-              <w:t>75</w:t>
-            </w:r>
-          </w:p>
-        </w:tc>
-      </w:tr>
-      <w:tr>
-        <w:tc>
-          <w:tcPr>
-            <w:tcW w:type="dxa" w:w="2880"/>
-            <w:vAlign w:val="center"/>
-            <w:shd w:fill="FFF4CC"/>
-          </w:tcPr>
-          <w:p>
-            <w:r>
-              <w:rPr>
-                <w:rFonts w:ascii="Arial" w:hAnsi="Arial"/>
-                <w:b w:val="0"/>
-                <w:sz w:val="18"/>
-              </w:rPr>
-              <w:t>13:00–13:30</w:t>
-            </w:r>
-          </w:p>
-        </w:tc>
-        <w:tc>
-          <w:tcPr>
-            <w:tcW w:type="dxa" w:w="2880"/>
-            <w:vAlign w:val="center"/>
-            <w:shd w:fill="FFF4CC"/>
-          </w:tcPr>
-          <w:p>
-            <w:r>
-              <w:rPr>
-                <w:rFonts w:ascii="Arial" w:hAnsi="Arial"/>
-                <w:b w:val="0"/>
-                <w:sz w:val="18"/>
-              </w:rPr>
-              <w:t>Lunch</w:t>
-            </w:r>
-          </w:p>
-        </w:tc>
-        <w:tc>
-          <w:tcPr>
-            <w:tcW w:type="dxa" w:w="2880"/>
-            <w:vAlign w:val="center"/>
-            <w:shd w:fill="FFF4CC"/>
-          </w:tcPr>
-          <w:p>
-            <w:r>
-              <w:rPr>
-                <w:rFonts w:ascii="Arial" w:hAnsi="Arial"/>
-                <w:b w:val="0"/>
-                <w:sz w:val="18"/>
-              </w:rPr>
               <w:t>30</w:t>
             </w:r>
           </w:p>
@@ -1275,116 +910,10 @@
         <w:tc>
           <w:tcPr>
             <w:tcW w:type="dxa" w:w="2880"/>
-            <w:vAlign w:val="center"/>
-          </w:tcPr>
-          <w:p>
-            <w:r>
-              <w:rPr>
-                <w:rFonts w:ascii="Arial" w:hAnsi="Arial"/>
-                <w:b w:val="0"/>
-                <w:sz w:val="18"/>
-              </w:rPr>
-              <w:t>13:30–14:15</w:t>
-            </w:r>
-          </w:p>
-        </w:tc>
-        <w:tc>
-          <w:tcPr>
-            <w:tcW w:type="dxa" w:w="2880"/>
-            <w:vAlign w:val="center"/>
-          </w:tcPr>
-          <w:p>
-            <w:r>
-              <w:rPr>
-                <w:rFonts w:ascii="Arial" w:hAnsi="Arial"/>
-                <w:b w:val="0"/>
-                <w:sz w:val="18"/>
-              </w:rPr>
-              <w:t>CI failure exercise and release review</w:t>
-            </w:r>
-          </w:p>
-        </w:tc>
-        <w:tc>
-          <w:tcPr>
-            <w:tcW w:type="dxa" w:w="2880"/>
-            <w:vAlign w:val="center"/>
-          </w:tcPr>
-          <w:p>
-            <w:r>
-              <w:rPr>
-                <w:rFonts w:ascii="Arial" w:hAnsi="Arial"/>
-                <w:b w:val="0"/>
-                <w:sz w:val="18"/>
-              </w:rPr>
-              <w:t>45</w:t>
-            </w:r>
-          </w:p>
-        </w:tc>
-      </w:tr>
-      <w:tr>
-        <w:tc>
-          <w:tcPr>
-            <w:tcW w:type="dxa" w:w="2880"/>
-            <w:vAlign w:val="center"/>
-          </w:tcPr>
-          <w:p>
-            <w:r>
-              <w:rPr>
-                <w:rFonts w:ascii="Arial" w:hAnsi="Arial"/>
-                <w:b w:val="0"/>
-                <w:sz w:val="18"/>
-              </w:rPr>
-              <w:t>14:15–15:00</w:t>
-            </w:r>
-          </w:p>
-        </w:tc>
-        <w:tc>
-          <w:tcPr>
-            <w:tcW w:type="dxa" w:w="2880"/>
-            <w:vAlign w:val="center"/>
-          </w:tcPr>
-          <w:p>
-            <w:r>
-              <w:rPr>
-                <w:rFonts w:ascii="Arial" w:hAnsi="Arial"/>
-                <w:b w:val="0"/>
-                <w:sz w:val="18"/>
-              </w:rPr>
-              <w:t>Topic 4: skills, subagents and MCP</w:t>
-            </w:r>
-          </w:p>
-        </w:tc>
-        <w:tc>
-          <w:tcPr>
-            <w:tcW w:type="dxa" w:w="2880"/>
-            <w:vAlign w:val="center"/>
-          </w:tcPr>
-          <w:p>
-            <w:r>
-              <w:rPr>
-                <w:rFonts w:ascii="Arial" w:hAnsi="Arial"/>
-                <w:b w:val="0"/>
-                <w:sz w:val="18"/>
-              </w:rPr>
-              <w:t>45</w:t>
-            </w:r>
-          </w:p>
-        </w:tc>
-      </w:tr>
-      <w:tr>
-        <w:tc>
-          <w:tcPr>
-            <w:tcW w:type="dxa" w:w="2880"/>
-            <w:vAlign w:val="center"/>
             <w:shd w:fill="FFF4CC"/>
           </w:tcPr>
           <w:p>
             <w:r>
-              <w:rPr>
-                <w:rFonts w:ascii="Arial" w:hAnsi="Arial"/>
-                <w:b w:val="0"/>
-                <w:sz w:val="18"/>
-              </w:rPr>
               <w:t>15:00–15:15</w:t>
             </w:r>
           </w:p>
@@ -1392,16 +921,10 @@
         <w:tc>
           <w:tcPr>
             <w:tcW w:type="dxa" w:w="2880"/>
-            <w:vAlign w:val="center"/>
             <w:shd w:fill="FFF4CC"/>
           </w:tcPr>
           <w:p>
             <w:r>
-              <w:rPr>
-                <w:rFonts w:ascii="Arial" w:hAnsi="Arial"/>
-                <w:b w:val="0"/>
-                <w:sz w:val="18"/>
-              </w:rPr>
               <w:t>Tea break</w:t>
             </w:r>
           </w:p>
@@ -1409,16 +932,10 @@
         <w:tc>
           <w:tcPr>
             <w:tcW w:type="dxa" w:w="2880"/>
-            <w:vAlign w:val="center"/>
             <w:shd w:fill="FFF4CC"/>
           </w:tcPr>
           <w:p>
             <w:r>
-              <w:rPr>
-                <w:rFonts w:ascii="Arial" w:hAnsi="Arial"/>
-                <w:b w:val="0"/>
-                <w:sz w:val="18"/>
-              </w:rPr>
               <w:t>15</w:t>
             </w:r>
           </w:p>
@@ -1428,51 +945,30 @@
         <w:tc>
           <w:tcPr>
             <w:tcW w:type="dxa" w:w="2880"/>
-            <w:vAlign w:val="center"/>
-            <w:shd w:fill="E8F8F1"/>
           </w:tcPr>
           <w:p>
             <w:r>
-              <w:rPr>
-                <w:rFonts w:ascii="Arial" w:hAnsi="Arial"/>
-                <w:b w:val="0"/>
-                <w:sz w:val="18"/>
-              </w:rPr>
-              <w:t>15:15–16:15</w:t>
+              <w:t>15:15–16:45</w:t>
             </w:r>
           </w:p>
         </w:tc>
         <w:tc>
           <w:tcPr>
             <w:tcW w:type="dxa" w:w="2880"/>
-            <w:vAlign w:val="center"/>
-            <w:shd w:fill="E8F8F1"/>
           </w:tcPr>
           <w:p>
             <w:r>
-              <w:rPr>
-                <w:rFonts w:ascii="Arial" w:hAnsi="Arial"/>
-                <w:b w:val="0"/>
-                <w:sz w:val="18"/>
-              </w:rPr>
-              <w:t>Lab 7: non-WSQ reusable agent tooling</w:t>
+              <w:t>Labs 4.1–4.5: skills, hooks, subagents and MCP</w:t>
             </w:r>
           </w:p>
         </w:tc>
         <w:tc>
           <w:tcPr>
             <w:tcW w:type="dxa" w:w="2880"/>
-            <w:vAlign w:val="center"/>
-            <w:shd w:fill="E8F8F1"/>
           </w:tcPr>
           <w:p>
             <w:r>
-              <w:rPr>
-                <w:rFonts w:ascii="Arial" w:hAnsi="Arial"/>
-                <w:b w:val="0"/>
-                <w:sz w:val="18"/>
-              </w:rPr>
-              <w:t>60</w:t>
+              <w:t>90</w:t>
             </w:r>
           </w:p>
         </w:tc>
@@ -1481,101 +977,30 @@
         <w:tc>
           <w:tcPr>
             <w:tcW w:type="dxa" w:w="2880"/>
-            <w:vAlign w:val="center"/>
-            <w:shd w:fill="E8F8F1"/>
           </w:tcPr>
           <w:p>
             <w:r>
-              <w:rPr>
-                <w:rFonts w:ascii="Arial" w:hAnsi="Arial"/>
-                <w:b w:val="0"/>
-                <w:sz w:val="18"/>
-              </w:rPr>
-              <w:t>16:15–17:15</w:t>
+              <w:t>16:45–17:30</w:t>
             </w:r>
           </w:p>
         </w:tc>
         <w:tc>
           <w:tcPr>
             <w:tcW w:type="dxa" w:w="2880"/>
-            <w:vAlign w:val="center"/>
-            <w:shd w:fill="E8F8F1"/>
           </w:tcPr>
           <w:p>
             <w:r>
-              <w:rPr>
-                <w:rFonts w:ascii="Arial" w:hAnsi="Arial"/>
-                <w:b w:val="0"/>
-                <w:sz w:val="18"/>
-              </w:rPr>
-              <w:t>Lab 8: MCP-style tool and orchestration</w:t>
+              <w:t>Lab 4.6 capstone release, peer explanation and close</w:t>
             </w:r>
           </w:p>
         </w:tc>
         <w:tc>
           <w:tcPr>
             <w:tcW w:type="dxa" w:w="2880"/>
-            <w:vAlign w:val="center"/>
-            <w:shd w:fill="E8F8F1"/>
           </w:tcPr>
           <w:p>
             <w:r>
-              <w:rPr>
-                <w:rFonts w:ascii="Arial" w:hAnsi="Arial"/>
-                <w:b w:val="0"/>
-                <w:sz w:val="18"/>
-              </w:rPr>
-              <w:t>60</w:t>
-            </w:r>
-          </w:p>
-        </w:tc>
-      </w:tr>
-      <w:tr>
-        <w:tc>
-          <w:tcPr>
-            <w:tcW w:type="dxa" w:w="2880"/>
-            <w:vAlign w:val="center"/>
-          </w:tcPr>
-          <w:p>
-            <w:r>
-              <w:rPr>
-                <w:rFonts w:ascii="Arial" w:hAnsi="Arial"/>
-                <w:b w:val="0"/>
-                <w:sz w:val="18"/>
-              </w:rPr>
-              <w:t>17:15–17:30</w:t>
-            </w:r>
-          </w:p>
-        </w:tc>
-        <w:tc>
-          <w:tcPr>
-            <w:tcW w:type="dxa" w:w="2880"/>
-            <w:vAlign w:val="center"/>
-          </w:tcPr>
-          <w:p>
-            <w:r>
-              <w:rPr>
-                <w:rFonts w:ascii="Arial" w:hAnsi="Arial"/>
-                <w:b w:val="0"/>
-                <w:sz w:val="18"/>
-              </w:rPr>
-              <w:t>Capstone demonstration and close</w:t>
-            </w:r>
-          </w:p>
-        </w:tc>
-        <w:tc>
-          <w:tcPr>
-            <w:tcW w:type="dxa" w:w="2880"/>
-            <w:vAlign w:val="center"/>
-          </w:tcPr>
-          <w:p>
-            <w:r>
-              <w:rPr>
-                <w:rFonts w:ascii="Arial" w:hAnsi="Arial"/>
-                <w:b w:val="0"/>
-                <w:sz w:val="18"/>
-              </w:rPr>
-              <w:t>15</w:t>
+              <w:t>45</w:t>
             </w:r>
           </w:p>
         </w:tc>
@@ -1583,7 +1008,7 @@
     </w:tbl>
     <w:p>
       <w:r>
-        <w:t>Classroom window: 480 minutes; instructional/contact time excluding lunch: 450 minutes (7.5 hours).</w:t>
+        <w:t>Instructional/contact time excluding lunch: 450 minutes (7.5 hours).</w:t>
       </w:r>
     </w:p>
     <w:p>
@@ -1591,44 +1016,18 @@
         <w:pStyle w:val="Title"/>
       </w:pPr>
       <w:r>
-        <w:t>4. Facilitation Methods</w:t>
+        <w:t>Facilitation and Learning Checks</w:t>
       </w:r>
     </w:p>
     <w:p>
       <w:r>
-        <w:t>Short demonstrations, think-aloud prompt design, paired diff reviews, guided labs, failure injection, evidence checkpoints and capstone demonstration.</w:t>
-      </w:r>
-    </w:p>
-    <w:p>
-      <w:pPr>
-        <w:pStyle w:val="Title"/>
-      </w:pPr>
-      <w:r>
-        <w:t>5. Tools and Resources</w:t>
-      </w:r>
-    </w:p>
-    <w:p>
-      <w:r>
-        <w:t>Laptop, Git, GitHub, Node.js 20+, browser, code editor, supported coding agent, course repository and learner guide. Use synthetic data and placeholder credentials only.</w:t>
-      </w:r>
-    </w:p>
-    <w:p>
-      <w:pPr>
-        <w:pStyle w:val="Title"/>
-      </w:pPr>
-      <w:r>
-        <w:t>6. Progress Checks</w:t>
-      </w:r>
-    </w:p>
-    <w:p>
-      <w:r>
-        <w:t>Progress is formative: observable lab checkpoints, test output, reviewed diffs and final capstone demonstration. No formal assessment is included.</w:t>
+        <w:t>Use observation checklists, prompt/diff walkthroughs, command output, peer explanation, failure injection and capstone demonstration. Provide extra scaffolding through partially completed prompt contracts; extend faster learners with changed boundaries and security review.</w:t>
       </w:r>
     </w:p>
     <w:sectPr>
-      <w:footerReference w:type="default" r:id="rId9"/>
+      <w:footerReference w:type="default" r:id="rId10"/>
       <w:pgSz w:w="12240" w:h="15840"/>
-      <w:pgMar w:top="936" w:right="1800" w:bottom="936" w:left="1800" w:header="720" w:footer="720" w:gutter="0"/>
+      <w:pgMar w:top="1008" w:right="1800" w:bottom="936" w:left="1800" w:header="720" w:footer="720" w:gutter="0"/>
       <w:cols w:space="720"/>
       <w:docGrid w:linePitch="360"/>
     </w:sectPr>
@@ -1644,12 +1043,11 @@
       <w:jc w:val="center"/>
     </w:pPr>
     <w:r>
-      <w:t xml:space="preserve">© 2026 Tertiary Infotech Academy Pte Ltd. All rights reserved.  |  www.tertiarycourses.com.sg  |  Page </w:t>
+      <w:t xml:space="preserve">© 2026 Tertiary Infotech Academy Pte Ltd. All rights reserved. | www.tertiarycourses.com.sg | Page </w:t>
     </w:r>
     <w:r>
       <w:fldChar w:fldCharType="begin"/>
       <w:instrText xml:space="preserve">PAGE</w:instrText>
-      <w:fldChar w:fldCharType="separate"/>
       <w:fldChar w:fldCharType="end"/>
     </w:r>
     <w:r>
@@ -1658,7 +1056,6 @@
     <w:r>
       <w:fldChar w:fldCharType="begin"/>
       <w:instrText xml:space="preserve">NUMPAGES</w:instrText>
-      <w:fldChar w:fldCharType="separate"/>
       <w:fldChar w:fldCharType="end"/>
     </w:r>
   </w:p>
@@ -2047,6 +1444,9 @@
       </w:tabs>
       <w:spacing w:after="0" w:line="240" w:lineRule="auto"/>
     </w:pPr>
+    <w:rPr>
+      <w:rFonts w:ascii="Arial" w:hAnsi="Arial"/>
+    </w:rPr>
   </w:style>
   <w:style w:type="character" w:customStyle="1" w:styleId="HeaderChar">
     <w:name w:val="Header Char"/>
@@ -2054,6 +1454,9 @@
     <w:link w:val="Header"/>
     <w:uiPriority w:val="99"/>
     <w:rsid w:val="00E618BF"/>
+    <w:rPr>
+      <w:rFonts w:ascii="Arial" w:hAnsi="Arial"/>
+    </w:rPr>
   </w:style>
   <w:style w:type="paragraph" w:styleId="Footer">
     <w:name w:val="footer"/>
@@ -2069,6 +1472,9 @@
       </w:tabs>
       <w:spacing w:after="0" w:line="240" w:lineRule="auto"/>
     </w:pPr>
+    <w:rPr>
+      <w:rFonts w:ascii="Arial" w:hAnsi="Arial"/>
+    </w:rPr>
   </w:style>
   <w:style w:type="character" w:customStyle="1" w:styleId="FooterChar">
     <w:name w:val="Footer Char"/>
@@ -2076,6 +1482,9 @@
     <w:link w:val="Footer"/>
     <w:uiPriority w:val="99"/>
     <w:rsid w:val="00E618BF"/>
+    <w:rPr>
+      <w:rFonts w:ascii="Arial" w:hAnsi="Arial"/>
+    </w:rPr>
   </w:style>
   <w:style w:type="paragraph" w:styleId="Heading1">
     <w:name w:val="heading 1"/>
@@ -2096,7 +1505,7 @@
       <w:b/>
       <w:bCs/>
       <w:color w:val="1F6FEB"/>
-      <w:sz w:val="28"/>
+      <w:sz w:val="40"/>
       <w:szCs w:val="28"/>
     </w:rPr>
   </w:style>
@@ -2119,8 +1528,8 @@
       <w:rFonts w:asciiTheme="majorHAnsi" w:eastAsiaTheme="majorEastAsia" w:hAnsiTheme="majorHAnsi" w:cstheme="majorBidi" w:ascii="Arial" w:hAnsi="Arial"/>
       <w:b/>
       <w:bCs/>
-      <w:color w:val="1F6FEB"/>
-      <w:sz w:val="26"/>
+      <w:color w:val="10B981"/>
+      <w:sz w:val="32"/>
       <w:szCs w:val="26"/>
     </w:rPr>
   </w:style>
@@ -2143,7 +1552,8 @@
       <w:rFonts w:asciiTheme="majorHAnsi" w:eastAsiaTheme="majorEastAsia" w:hAnsiTheme="majorHAnsi" w:cstheme="majorBidi" w:ascii="Arial" w:hAnsi="Arial"/>
       <w:b/>
       <w:bCs/>
-      <w:color w:val="1F6FEB"/>
+      <w:color w:val="7C3AED"/>
+      <w:sz w:val="24"/>
     </w:rPr>
   </w:style>
   <w:style w:type="paragraph" w:styleId="Heading4">
@@ -2163,7 +1573,7 @@
       <w:outlineLvl w:val="3"/>
     </w:pPr>
     <w:rPr>
-      <w:rFonts w:asciiTheme="majorHAnsi" w:eastAsiaTheme="majorEastAsia" w:hAnsiTheme="majorHAnsi" w:cstheme="majorBidi"/>
+      <w:rFonts w:asciiTheme="majorHAnsi" w:eastAsiaTheme="majorEastAsia" w:hAnsiTheme="majorHAnsi" w:cstheme="majorBidi" w:ascii="Arial" w:hAnsi="Arial"/>
       <w:b/>
       <w:bCs/>
       <w:i/>
@@ -2188,7 +1598,7 @@
       <w:outlineLvl w:val="4"/>
     </w:pPr>
     <w:rPr>
-      <w:rFonts w:asciiTheme="majorHAnsi" w:eastAsiaTheme="majorEastAsia" w:hAnsiTheme="majorHAnsi" w:cstheme="majorBidi"/>
+      <w:rFonts w:asciiTheme="majorHAnsi" w:eastAsiaTheme="majorEastAsia" w:hAnsiTheme="majorHAnsi" w:cstheme="majorBidi" w:ascii="Arial" w:hAnsi="Arial"/>
       <w:color w:val="243F60" w:themeColor="accent1" w:themeShade="7F"/>
     </w:rPr>
   </w:style>
@@ -2209,7 +1619,7 @@
       <w:outlineLvl w:val="5"/>
     </w:pPr>
     <w:rPr>
-      <w:rFonts w:asciiTheme="majorHAnsi" w:eastAsiaTheme="majorEastAsia" w:hAnsiTheme="majorHAnsi" w:cstheme="majorBidi"/>
+      <w:rFonts w:asciiTheme="majorHAnsi" w:eastAsiaTheme="majorEastAsia" w:hAnsiTheme="majorHAnsi" w:cstheme="majorBidi" w:ascii="Arial" w:hAnsi="Arial"/>
       <w:i/>
       <w:iCs/>
       <w:color w:val="243F60" w:themeColor="accent1" w:themeShade="7F"/>
@@ -2232,7 +1642,7 @@
       <w:outlineLvl w:val="6"/>
     </w:pPr>
     <w:rPr>
-      <w:rFonts w:asciiTheme="majorHAnsi" w:eastAsiaTheme="majorEastAsia" w:hAnsiTheme="majorHAnsi" w:cstheme="majorBidi"/>
+      <w:rFonts w:asciiTheme="majorHAnsi" w:eastAsiaTheme="majorEastAsia" w:hAnsiTheme="majorHAnsi" w:cstheme="majorBidi" w:ascii="Arial" w:hAnsi="Arial"/>
       <w:i/>
       <w:iCs/>
       <w:color w:val="404040" w:themeColor="text1" w:themeTint="BF"/>
@@ -2255,7 +1665,7 @@
       <w:outlineLvl w:val="7"/>
     </w:pPr>
     <w:rPr>
-      <w:rFonts w:asciiTheme="majorHAnsi" w:eastAsiaTheme="majorEastAsia" w:hAnsiTheme="majorHAnsi" w:cstheme="majorBidi"/>
+      <w:rFonts w:asciiTheme="majorHAnsi" w:eastAsiaTheme="majorEastAsia" w:hAnsiTheme="majorHAnsi" w:cstheme="majorBidi" w:ascii="Arial" w:hAnsi="Arial"/>
       <w:color w:val="4F81BD" w:themeColor="accent1"/>
       <w:sz w:val="20"/>
       <w:szCs w:val="20"/>
@@ -2278,7 +1688,7 @@
       <w:outlineLvl w:val="8"/>
     </w:pPr>
     <w:rPr>
-      <w:rFonts w:asciiTheme="majorHAnsi" w:eastAsiaTheme="majorEastAsia" w:hAnsiTheme="majorHAnsi" w:cstheme="majorBidi"/>
+      <w:rFonts w:asciiTheme="majorHAnsi" w:eastAsiaTheme="majorEastAsia" w:hAnsiTheme="majorHAnsi" w:cstheme="majorBidi" w:ascii="Arial" w:hAnsi="Arial"/>
       <w:i/>
       <w:iCs/>
       <w:color w:val="404040" w:themeColor="text1" w:themeTint="BF"/>
@@ -2291,12 +1701,18 @@
     <w:uiPriority w:val="1"/>
     <w:semiHidden/>
     <w:unhideWhenUsed/>
+    <w:rPr>
+      <w:rFonts w:ascii="Arial" w:hAnsi="Arial"/>
+    </w:rPr>
   </w:style>
   <w:style w:type="table" w:default="1" w:styleId="TableNormal">
     <w:name w:val="Normal Table"/>
     <w:uiPriority w:val="99"/>
     <w:semiHidden/>
     <w:unhideWhenUsed/>
+    <w:rPr>
+      <w:rFonts w:ascii="Arial" w:hAnsi="Arial"/>
+    </w:rPr>
     <w:tblPr>
       <w:tblInd w:w="0" w:type="dxa"/>
       <w:tblCellMar>
@@ -2321,6 +1737,9 @@
     <w:pPr>
       <w:spacing w:after="0" w:line="240" w:lineRule="auto"/>
     </w:pPr>
+    <w:rPr>
+      <w:rFonts w:ascii="Arial" w:hAnsi="Arial"/>
+    </w:rPr>
   </w:style>
   <w:style w:type="character" w:customStyle="1" w:styleId="Heading1Char">
     <w:name w:val="Heading 1 Char"/>
@@ -2329,7 +1748,7 @@
     <w:uiPriority w:val="9"/>
     <w:rsid w:val="00FC693F"/>
     <w:rPr>
-      <w:rFonts w:asciiTheme="majorHAnsi" w:eastAsiaTheme="majorEastAsia" w:hAnsiTheme="majorHAnsi" w:cstheme="majorBidi"/>
+      <w:rFonts w:asciiTheme="majorHAnsi" w:eastAsiaTheme="majorEastAsia" w:hAnsiTheme="majorHAnsi" w:cstheme="majorBidi" w:ascii="Arial" w:hAnsi="Arial"/>
       <w:b/>
       <w:bCs/>
       <w:color w:val="365F91" w:themeColor="accent1" w:themeShade="BF"/>
@@ -2344,7 +1763,7 @@
     <w:uiPriority w:val="9"/>
     <w:rsid w:val="00FC693F"/>
     <w:rPr>
-      <w:rFonts w:asciiTheme="majorHAnsi" w:eastAsiaTheme="majorEastAsia" w:hAnsiTheme="majorHAnsi" w:cstheme="majorBidi"/>
+      <w:rFonts w:asciiTheme="majorHAnsi" w:eastAsiaTheme="majorEastAsia" w:hAnsiTheme="majorHAnsi" w:cstheme="majorBidi" w:ascii="Arial" w:hAnsi="Arial"/>
       <w:b/>
       <w:bCs/>
       <w:color w:val="4F81BD" w:themeColor="accent1"/>
@@ -2359,7 +1778,7 @@
     <w:uiPriority w:val="9"/>
     <w:rsid w:val="00FC693F"/>
     <w:rPr>
-      <w:rFonts w:asciiTheme="majorHAnsi" w:eastAsiaTheme="majorEastAsia" w:hAnsiTheme="majorHAnsi" w:cstheme="majorBidi"/>
+      <w:rFonts w:asciiTheme="majorHAnsi" w:eastAsiaTheme="majorEastAsia" w:hAnsiTheme="majorHAnsi" w:cstheme="majorBidi" w:ascii="Arial" w:hAnsi="Arial"/>
       <w:b/>
       <w:bCs/>
       <w:color w:val="4F81BD" w:themeColor="accent1"/>
@@ -2382,10 +1801,11 @@
     </w:pPr>
     <w:rPr>
       <w:rFonts w:asciiTheme="majorHAnsi" w:eastAsiaTheme="majorEastAsia" w:hAnsiTheme="majorHAnsi" w:cstheme="majorBidi" w:ascii="Arial" w:hAnsi="Arial"/>
+      <w:b/>
       <w:color w:val="1F6FEB"/>
       <w:spacing w:val="5"/>
       <w:kern w:val="28"/>
-      <w:sz w:val="52"/>
+      <w:sz w:val="60"/>
       <w:szCs w:val="52"/>
     </w:rPr>
   </w:style>
@@ -2396,7 +1816,7 @@
     <w:uiPriority w:val="10"/>
     <w:rsid w:val="00FC693F"/>
     <w:rPr>
-      <w:rFonts w:asciiTheme="majorHAnsi" w:eastAsiaTheme="majorEastAsia" w:hAnsiTheme="majorHAnsi" w:cstheme="majorBidi"/>
+      <w:rFonts w:asciiTheme="majorHAnsi" w:eastAsiaTheme="majorEastAsia" w:hAnsiTheme="majorHAnsi" w:cstheme="majorBidi" w:ascii="Arial" w:hAnsi="Arial"/>
       <w:color w:val="17365D" w:themeColor="text2" w:themeShade="BF"/>
       <w:spacing w:val="5"/>
       <w:kern w:val="28"/>
@@ -2421,7 +1841,7 @@
       <w:rFonts w:asciiTheme="majorHAnsi" w:eastAsiaTheme="majorEastAsia" w:hAnsiTheme="majorHAnsi" w:cstheme="majorBidi" w:ascii="Arial" w:hAnsi="Arial"/>
       <w:i/>
       <w:iCs/>
-      <w:color w:val="1F6FEB"/>
+      <w:color w:val="4F81BD" w:themeColor="accent1"/>
       <w:spacing w:val="15"/>
       <w:sz w:val="24"/>
       <w:szCs w:val="24"/>
@@ -2434,7 +1854,7 @@
     <w:uiPriority w:val="11"/>
     <w:rsid w:val="00FC693F"/>
     <w:rPr>
-      <w:rFonts w:asciiTheme="majorHAnsi" w:eastAsiaTheme="majorEastAsia" w:hAnsiTheme="majorHAnsi" w:cstheme="majorBidi"/>
+      <w:rFonts w:asciiTheme="majorHAnsi" w:eastAsiaTheme="majorEastAsia" w:hAnsiTheme="majorHAnsi" w:cstheme="majorBidi" w:ascii="Arial" w:hAnsi="Arial"/>
       <w:i/>
       <w:iCs/>
       <w:color w:val="4F81BD" w:themeColor="accent1"/>
@@ -2453,6 +1873,9 @@
       <w:ind w:left="720"/>
       <w:contextualSpacing/>
     </w:pPr>
+    <w:rPr>
+      <w:rFonts w:ascii="Arial" w:hAnsi="Arial"/>
+    </w:rPr>
   </w:style>
   <w:style w:type="paragraph" w:styleId="BodyText">
     <w:name w:val="Body Text"/>
@@ -2464,6 +1887,9 @@
     <w:pPr>
       <w:spacing w:after="120"/>
     </w:pPr>
+    <w:rPr>
+      <w:rFonts w:ascii="Arial" w:hAnsi="Arial"/>
+    </w:rPr>
   </w:style>
   <w:style w:type="character" w:customStyle="1" w:styleId="BodyTextChar">
     <w:name w:val="Body Text Char"/>
@@ -2471,6 +1897,9 @@
     <w:link w:val="BodyText"/>
     <w:uiPriority w:val="99"/>
     <w:rsid w:val="00AA1D8D"/>
+    <w:rPr>
+      <w:rFonts w:ascii="Arial" w:hAnsi="Arial"/>
+    </w:rPr>
   </w:style>
   <w:style w:type="paragraph" w:styleId="BodyText2">
     <w:name w:val="Body Text 2"/>
@@ -2482,6 +1911,9 @@
     <w:pPr>
       <w:spacing w:after="120" w:line="480" w:lineRule="auto"/>
     </w:pPr>
+    <w:rPr>
+      <w:rFonts w:ascii="Arial" w:hAnsi="Arial"/>
+    </w:rPr>
   </w:style>
   <w:style w:type="character" w:customStyle="1" w:styleId="BodyText2Char">
     <w:name w:val="Body Text 2 Char"/>
@@ -2489,6 +1921,9 @@
     <w:link w:val="BodyText2"/>
     <w:uiPriority w:val="99"/>
     <w:rsid w:val="00AA1D8D"/>
+    <w:rPr>
+      <w:rFonts w:ascii="Arial" w:hAnsi="Arial"/>
+    </w:rPr>
   </w:style>
   <w:style w:type="paragraph" w:styleId="BodyText3">
     <w:name w:val="Body Text 3"/>
@@ -2501,6 +1936,7 @@
       <w:spacing w:after="120"/>
     </w:pPr>
     <w:rPr>
+      <w:rFonts w:ascii="Arial" w:hAnsi="Arial"/>
       <w:sz w:val="16"/>
       <w:szCs w:val="16"/>
     </w:rPr>
@@ -2512,6 +1948,7 @@
     <w:uiPriority w:val="99"/>
     <w:rsid w:val="00AA1D8D"/>
     <w:rPr>
+      <w:rFonts w:ascii="Arial" w:hAnsi="Arial"/>
       <w:sz w:val="16"/>
       <w:szCs w:val="16"/>
     </w:rPr>
@@ -2526,6 +1963,9 @@
       <w:ind w:left="360" w:hanging="360"/>
       <w:contextualSpacing/>
     </w:pPr>
+    <w:rPr>
+      <w:rFonts w:ascii="Arial" w:hAnsi="Arial"/>
+    </w:rPr>
   </w:style>
   <w:style w:type="paragraph" w:styleId="List2">
     <w:name w:val="List 2"/>
@@ -2537,6 +1977,9 @@
       <w:ind w:left="720" w:hanging="360"/>
       <w:contextualSpacing/>
     </w:pPr>
+    <w:rPr>
+      <w:rFonts w:ascii="Arial" w:hAnsi="Arial"/>
+    </w:rPr>
   </w:style>
   <w:style w:type="paragraph" w:styleId="List3">
     <w:name w:val="List 3"/>
@@ -2548,6 +1991,9 @@
       <w:ind w:left="1080" w:hanging="360"/>
       <w:contextualSpacing/>
     </w:pPr>
+    <w:rPr>
+      <w:rFonts w:ascii="Arial" w:hAnsi="Arial"/>
+    </w:rPr>
   </w:style>
   <w:style w:type="paragraph" w:styleId="ListBullet">
     <w:name w:val="List Bullet"/>
@@ -2561,6 +2007,9 @@
       </w:numPr>
       <w:contextualSpacing/>
     </w:pPr>
+    <w:rPr>
+      <w:rFonts w:ascii="Arial" w:hAnsi="Arial"/>
+    </w:rPr>
   </w:style>
   <w:style w:type="paragraph" w:styleId="ListBullet2">
     <w:name w:val="List Bullet 2"/>
@@ -2574,6 +2023,9 @@
       </w:numPr>
       <w:contextualSpacing/>
     </w:pPr>
+    <w:rPr>
+      <w:rFonts w:ascii="Arial" w:hAnsi="Arial"/>
+    </w:rPr>
   </w:style>
   <w:style w:type="paragraph" w:styleId="ListBullet3">
     <w:name w:val="List Bullet 3"/>
@@ -2587,6 +2039,9 @@
       </w:numPr>
       <w:contextualSpacing/>
     </w:pPr>
+    <w:rPr>
+      <w:rFonts w:ascii="Arial" w:hAnsi="Arial"/>
+    </w:rPr>
   </w:style>
   <w:style w:type="paragraph" w:styleId="ListNumber">
     <w:name w:val="List Number"/>
@@ -2600,6 +2055,9 @@
       </w:numPr>
       <w:contextualSpacing/>
     </w:pPr>
+    <w:rPr>
+      <w:rFonts w:ascii="Arial" w:hAnsi="Arial"/>
+    </w:rPr>
   </w:style>
   <w:style w:type="paragraph" w:styleId="ListNumber2">
     <w:name w:val="List Number 2"/>
@@ -2613,6 +2071,9 @@
       </w:numPr>
       <w:contextualSpacing/>
     </w:pPr>
+    <w:rPr>
+      <w:rFonts w:ascii="Arial" w:hAnsi="Arial"/>
+    </w:rPr>
   </w:style>
   <w:style w:type="paragraph" w:styleId="ListNumber3">
     <w:name w:val="List Number 3"/>
@@ -2626,6 +2087,9 @@
       </w:numPr>
       <w:contextualSpacing/>
     </w:pPr>
+    <w:rPr>
+      <w:rFonts w:ascii="Arial" w:hAnsi="Arial"/>
+    </w:rPr>
   </w:style>
   <w:style w:type="paragraph" w:styleId="ListContinue">
     <w:name w:val="List Continue"/>
@@ -2638,6 +2102,9 @@
       <w:ind w:left="360"/>
       <w:contextualSpacing/>
     </w:pPr>
+    <w:rPr>
+      <w:rFonts w:ascii="Arial" w:hAnsi="Arial"/>
+    </w:rPr>
   </w:style>
   <w:style w:type="paragraph" w:styleId="ListContinue2">
     <w:name w:val="List Continue 2"/>
@@ -2650,6 +2117,9 @@
       <w:ind w:left="720"/>
       <w:contextualSpacing/>
     </w:pPr>
+    <w:rPr>
+      <w:rFonts w:ascii="Arial" w:hAnsi="Arial"/>
+    </w:rPr>
   </w:style>
   <w:style w:type="paragraph" w:styleId="ListContinue3">
     <w:name w:val="List Continue 3"/>
@@ -2662,6 +2132,9 @@
       <w:ind w:left="1080"/>
       <w:contextualSpacing/>
     </w:pPr>
+    <w:rPr>
+      <w:rFonts w:ascii="Arial" w:hAnsi="Arial"/>
+    </w:rPr>
   </w:style>
   <w:style w:type="paragraph" w:styleId="MacroText">
     <w:name w:val="macro"/>
@@ -2681,7 +2154,7 @@
       </w:tabs>
     </w:pPr>
     <w:rPr>
-      <w:rFonts w:ascii="Courier" w:hAnsi="Courier"/>
+      <w:rFonts w:ascii="Arial" w:hAnsi="Arial"/>
       <w:sz w:val="20"/>
       <w:szCs w:val="20"/>
     </w:rPr>
@@ -2693,7 +2166,7 @@
     <w:uiPriority w:val="99"/>
     <w:rsid w:val="0029639D"/>
     <w:rPr>
-      <w:rFonts w:ascii="Courier" w:hAnsi="Courier"/>
+      <w:rFonts w:ascii="Arial" w:hAnsi="Arial"/>
       <w:sz w:val="20"/>
       <w:szCs w:val="20"/>
     </w:rPr>
@@ -2707,6 +2180,7 @@
     <w:qFormat/>
     <w:rsid w:val="00FC693F"/>
     <w:rPr>
+      <w:rFonts w:ascii="Arial" w:hAnsi="Arial"/>
       <w:i/>
       <w:iCs/>
       <w:color w:val="000000" w:themeColor="text1"/>
@@ -2719,6 +2193,7 @@
     <w:uiPriority w:val="29"/>
     <w:rsid w:val="00FC693F"/>
     <w:rPr>
+      <w:rFonts w:ascii="Arial" w:hAnsi="Arial"/>
       <w:i/>
       <w:iCs/>
       <w:color w:val="000000" w:themeColor="text1"/>
@@ -2732,7 +2207,7 @@
     <w:semiHidden/>
     <w:rsid w:val="00FC693F"/>
     <w:rPr>
-      <w:rFonts w:asciiTheme="majorHAnsi" w:eastAsiaTheme="majorEastAsia" w:hAnsiTheme="majorHAnsi" w:cstheme="majorBidi"/>
+      <w:rFonts w:asciiTheme="majorHAnsi" w:eastAsiaTheme="majorEastAsia" w:hAnsiTheme="majorHAnsi" w:cstheme="majorBidi" w:ascii="Arial" w:hAnsi="Arial"/>
       <w:b/>
       <w:bCs/>
       <w:i/>
@@ -2748,7 +2223,7 @@
     <w:semiHidden/>
     <w:rsid w:val="00FC693F"/>
     <w:rPr>
-      <w:rFonts w:asciiTheme="majorHAnsi" w:eastAsiaTheme="majorEastAsia" w:hAnsiTheme="majorHAnsi" w:cstheme="majorBidi"/>
+      <w:rFonts w:asciiTheme="majorHAnsi" w:eastAsiaTheme="majorEastAsia" w:hAnsiTheme="majorHAnsi" w:cstheme="majorBidi" w:ascii="Arial" w:hAnsi="Arial"/>
       <w:color w:val="243F60" w:themeColor="accent1" w:themeShade="7F"/>
     </w:rPr>
   </w:style>
@@ -2760,7 +2235,7 @@
     <w:semiHidden/>
     <w:rsid w:val="00FC693F"/>
     <w:rPr>
-      <w:rFonts w:asciiTheme="majorHAnsi" w:eastAsiaTheme="majorEastAsia" w:hAnsiTheme="majorHAnsi" w:cstheme="majorBidi"/>
+      <w:rFonts w:asciiTheme="majorHAnsi" w:eastAsiaTheme="majorEastAsia" w:hAnsiTheme="majorHAnsi" w:cstheme="majorBidi" w:ascii="Arial" w:hAnsi="Arial"/>
       <w:i/>
       <w:iCs/>
       <w:color w:val="243F60" w:themeColor="accent1" w:themeShade="7F"/>
@@ -2774,7 +2249,7 @@
     <w:semiHidden/>
     <w:rsid w:val="00FC693F"/>
     <w:rPr>
-      <w:rFonts w:asciiTheme="majorHAnsi" w:eastAsiaTheme="majorEastAsia" w:hAnsiTheme="majorHAnsi" w:cstheme="majorBidi"/>
+      <w:rFonts w:asciiTheme="majorHAnsi" w:eastAsiaTheme="majorEastAsia" w:hAnsiTheme="majorHAnsi" w:cstheme="majorBidi" w:ascii="Arial" w:hAnsi="Arial"/>
       <w:i/>
       <w:iCs/>
       <w:color w:val="404040" w:themeColor="text1" w:themeTint="BF"/>
@@ -2788,7 +2263,7 @@
     <w:semiHidden/>
     <w:rsid w:val="00FC693F"/>
     <w:rPr>
-      <w:rFonts w:asciiTheme="majorHAnsi" w:eastAsiaTheme="majorEastAsia" w:hAnsiTheme="majorHAnsi" w:cstheme="majorBidi"/>
+      <w:rFonts w:asciiTheme="majorHAnsi" w:eastAsiaTheme="majorEastAsia" w:hAnsiTheme="majorHAnsi" w:cstheme="majorBidi" w:ascii="Arial" w:hAnsi="Arial"/>
       <w:color w:val="4F81BD" w:themeColor="accent1"/>
       <w:sz w:val="20"/>
       <w:szCs w:val="20"/>
@@ -2802,7 +2277,7 @@
     <w:semiHidden/>
     <w:rsid w:val="00FC693F"/>
     <w:rPr>
-      <w:rFonts w:asciiTheme="majorHAnsi" w:eastAsiaTheme="majorEastAsia" w:hAnsiTheme="majorHAnsi" w:cstheme="majorBidi"/>
+      <w:rFonts w:asciiTheme="majorHAnsi" w:eastAsiaTheme="majorEastAsia" w:hAnsiTheme="majorHAnsi" w:cstheme="majorBidi" w:ascii="Arial" w:hAnsi="Arial"/>
       <w:i/>
       <w:iCs/>
       <w:color w:val="404040" w:themeColor="text1" w:themeTint="BF"/>
@@ -2823,6 +2298,7 @@
       <w:spacing w:line="240" w:lineRule="auto"/>
     </w:pPr>
     <w:rPr>
+      <w:rFonts w:ascii="Arial" w:hAnsi="Arial"/>
       <w:b/>
       <w:bCs/>
       <w:color w:val="4F81BD" w:themeColor="accent1"/>
@@ -2837,6 +2313,7 @@
     <w:qFormat/>
     <w:rsid w:val="00FC693F"/>
     <w:rPr>
+      <w:rFonts w:ascii="Arial" w:hAnsi="Arial"/>
       <w:b/>
       <w:bCs/>
     </w:rPr>
@@ -2848,6 +2325,7 @@
     <w:qFormat/>
     <w:rsid w:val="00FC693F"/>
     <w:rPr>
+      <w:rFonts w:ascii="Arial" w:hAnsi="Arial"/>
       <w:i/>
       <w:iCs/>
     </w:rPr>
@@ -2868,6 +2346,7 @@
       <w:ind w:left="936" w:right="936"/>
     </w:pPr>
     <w:rPr>
+      <w:rFonts w:ascii="Arial" w:hAnsi="Arial"/>
       <w:b/>
       <w:bCs/>
       <w:i/>
@@ -2882,6 +2361,7 @@
     <w:uiPriority w:val="30"/>
     <w:rsid w:val="00FC693F"/>
     <w:rPr>
+      <w:rFonts w:ascii="Arial" w:hAnsi="Arial"/>
       <w:b/>
       <w:bCs/>
       <w:i/>
@@ -2896,6 +2376,7 @@
     <w:qFormat/>
     <w:rsid w:val="00FC693F"/>
     <w:rPr>
+      <w:rFonts w:ascii="Arial" w:hAnsi="Arial"/>
       <w:i/>
       <w:iCs/>
       <w:color w:val="808080" w:themeColor="text1" w:themeTint="7F"/>
@@ -2908,6 +2389,7 @@
     <w:qFormat/>
     <w:rsid w:val="00FC693F"/>
     <w:rPr>
+      <w:rFonts w:ascii="Arial" w:hAnsi="Arial"/>
       <w:b/>
       <w:bCs/>
       <w:i/>
@@ -2922,6 +2404,7 @@
     <w:qFormat/>
     <w:rsid w:val="00FC693F"/>
     <w:rPr>
+      <w:rFonts w:ascii="Arial" w:hAnsi="Arial"/>
       <w:smallCaps/>
       <w:color w:val="C0504D" w:themeColor="accent2"/>
       <w:u w:val="single"/>
@@ -2934,6 +2417,7 @@
     <w:qFormat/>
     <w:rsid w:val="00FC693F"/>
     <w:rPr>
+      <w:rFonts w:ascii="Arial" w:hAnsi="Arial"/>
       <w:b/>
       <w:bCs/>
       <w:smallCaps/>
@@ -2949,6 +2433,7 @@
     <w:qFormat/>
     <w:rsid w:val="00FC693F"/>
     <w:rPr>
+      <w:rFonts w:ascii="Arial" w:hAnsi="Arial"/>
       <w:b/>
       <w:bCs/>
       <w:smallCaps/>
@@ -2967,6 +2452,9 @@
     <w:pPr>
       <w:outlineLvl w:val="9"/>
     </w:pPr>
+    <w:rPr>
+      <w:rFonts w:ascii="Arial" w:hAnsi="Arial"/>
+    </w:rPr>
   </w:style>
   <w:style w:type="table" w:styleId="TableGrid">
     <w:name w:val="Table Grid"/>
@@ -2976,6 +2464,9 @@
     <w:pPr>
       <w:spacing w:after="0" w:line="240" w:lineRule="auto"/>
     </w:pPr>
+    <w:rPr>
+      <w:rFonts w:ascii="Arial" w:hAnsi="Arial"/>
+    </w:rPr>
     <w:tblPr>
       <w:tblInd w:w="0" w:type="dxa"/>
       <w:tblBorders>
@@ -3003,6 +2494,7 @@
       <w:spacing w:after="0" w:line="240" w:lineRule="auto"/>
     </w:pPr>
     <w:rPr>
+      <w:rFonts w:ascii="Arial" w:hAnsi="Arial"/>
       <w:color w:val="000000" w:themeColor="text1" w:themeShade="BF"/>
     </w:rPr>
     <w:tblPr>
@@ -3106,6 +2598,7 @@
       <w:spacing w:after="0" w:line="240" w:lineRule="auto"/>
     </w:pPr>
     <w:rPr>
+      <w:rFonts w:ascii="Arial" w:hAnsi="Arial"/>
       <w:color w:val="365F91" w:themeColor="accent1" w:themeShade="BF"/>
     </w:rPr>
     <w:tblPr>
@@ -3209,6 +2702,7 @@
       <w:spacing w:after="0" w:line="240" w:lineRule="auto"/>
     </w:pPr>
     <w:rPr>
+      <w:rFonts w:ascii="Arial" w:hAnsi="Arial"/>
       <w:color w:val="943634" w:themeColor="accent2" w:themeShade="BF"/>
     </w:rPr>
     <w:tblPr>
@@ -3312,6 +2806,7 @@
       <w:spacing w:after="0" w:line="240" w:lineRule="auto"/>
     </w:pPr>
     <w:rPr>
+      <w:rFonts w:ascii="Arial" w:hAnsi="Arial"/>
       <w:color w:val="76923C" w:themeColor="accent3" w:themeShade="BF"/>
     </w:rPr>
     <w:tblPr>
@@ -3415,6 +2910,7 @@
       <w:spacing w:after="0" w:line="240" w:lineRule="auto"/>
     </w:pPr>
     <w:rPr>
+      <w:rFonts w:ascii="Arial" w:hAnsi="Arial"/>
       <w:color w:val="5F497A" w:themeColor="accent4" w:themeShade="BF"/>
     </w:rPr>
     <w:tblPr>
@@ -3518,6 +3014,7 @@
       <w:spacing w:after="0" w:line="240" w:lineRule="auto"/>
     </w:pPr>
     <w:rPr>
+      <w:rFonts w:ascii="Arial" w:hAnsi="Arial"/>
       <w:color w:val="31849B" w:themeColor="accent5" w:themeShade="BF"/>
     </w:rPr>
     <w:tblPr>
@@ -3621,6 +3118,7 @@
       <w:spacing w:after="0" w:line="240" w:lineRule="auto"/>
     </w:pPr>
     <w:rPr>
+      <w:rFonts w:ascii="Arial" w:hAnsi="Arial"/>
       <w:color w:val="E36C0A" w:themeColor="accent6" w:themeShade="BF"/>
     </w:rPr>
     <w:tblPr>
@@ -3723,6 +3221,9 @@
     <w:pPr>
       <w:spacing w:after="0" w:line="240" w:lineRule="auto"/>
     </w:pPr>
+    <w:rPr>
+      <w:rFonts w:ascii="Arial" w:hAnsi="Arial"/>
+    </w:rPr>
     <w:tblPr>
       <w:tblStyleRowBandSize w:val="1"/>
       <w:tblStyleColBandSize w:val="1"/>
@@ -3815,6 +3316,9 @@
     <w:pPr>
       <w:spacing w:after="0" w:line="240" w:lineRule="auto"/>
     </w:pPr>
+    <w:rPr>
+      <w:rFonts w:ascii="Arial" w:hAnsi="Arial"/>
+    </w:rPr>
     <w:tblPr>
       <w:tblStyleRowBandSize w:val="1"/>
       <w:tblStyleColBandSize w:val="1"/>
@@ -3907,6 +3411,9 @@
     <w:pPr>
       <w:spacing w:after="0" w:line="240" w:lineRule="auto"/>
     </w:pPr>
+    <w:rPr>
+      <w:rFonts w:ascii="Arial" w:hAnsi="Arial"/>
+    </w:rPr>
     <w:tblPr>
       <w:tblStyleRowBandSize w:val="1"/>
       <w:tblStyleColBandSize w:val="1"/>
@@ -3999,6 +3506,9 @@
     <w:pPr>
       <w:spacing w:after="0" w:line="240" w:lineRule="auto"/>
     </w:pPr>
+    <w:rPr>
+      <w:rFonts w:ascii="Arial" w:hAnsi="Arial"/>
+    </w:rPr>
     <w:tblPr>
       <w:tblStyleRowBandSize w:val="1"/>
       <w:tblStyleColBandSize w:val="1"/>
@@ -4091,6 +3601,9 @@
     <w:pPr>
       <w:spacing w:after="0" w:line="240" w:lineRule="auto"/>
     </w:pPr>
+    <w:rPr>
+      <w:rFonts w:ascii="Arial" w:hAnsi="Arial"/>
+    </w:rPr>
     <w:tblPr>
       <w:tblStyleRowBandSize w:val="1"/>
       <w:tblStyleColBandSize w:val="1"/>
@@ -4183,6 +3696,9 @@
     <w:pPr>
       <w:spacing w:after="0" w:line="240" w:lineRule="auto"/>
     </w:pPr>
+    <w:rPr>
+      <w:rFonts w:ascii="Arial" w:hAnsi="Arial"/>
+    </w:rPr>
     <w:tblPr>
       <w:tblStyleRowBandSize w:val="1"/>
       <w:tblStyleColBandSize w:val="1"/>
@@ -4275,6 +3791,9 @@
     <w:pPr>
       <w:spacing w:after="0" w:line="240" w:lineRule="auto"/>
     </w:pPr>
+    <w:rPr>
+      <w:rFonts w:ascii="Arial" w:hAnsi="Arial"/>
+    </w:rPr>
     <w:tblPr>
       <w:tblStyleRowBandSize w:val="1"/>
       <w:tblStyleColBandSize w:val="1"/>
@@ -4367,6 +3886,9 @@
     <w:pPr>
       <w:spacing w:after="0" w:line="240" w:lineRule="auto"/>
     </w:pPr>
+    <w:rPr>
+      <w:rFonts w:ascii="Arial" w:hAnsi="Arial"/>
+    </w:rPr>
     <w:tblPr>
       <w:tblStyleRowBandSize w:val="1"/>
       <w:tblStyleColBandSize w:val="1"/>
@@ -4497,6 +4019,9 @@
     <w:pPr>
       <w:spacing w:after="0" w:line="240" w:lineRule="auto"/>
     </w:pPr>
+    <w:rPr>
+      <w:rFonts w:ascii="Arial" w:hAnsi="Arial"/>
+    </w:rPr>
     <w:tblPr>
       <w:tblStyleRowBandSize w:val="1"/>
       <w:tblStyleColBandSize w:val="1"/>
@@ -4627,6 +4152,9 @@
     <w:pPr>
       <w:spacing w:after="0" w:line="240" w:lineRule="auto"/>
     </w:pPr>
+    <w:rPr>
+      <w:rFonts w:ascii="Arial" w:hAnsi="Arial"/>
+    </w:rPr>
     <w:tblPr>
       <w:tblStyleRowBandSize w:val="1"/>
       <w:tblStyleColBandSize w:val="1"/>
@@ -4757,6 +4285,9 @@
     <w:pPr>
       <w:spacing w:after="0" w:line="240" w:lineRule="auto"/>
     </w:pPr>
+    <w:rPr>
+      <w:rFonts w:ascii="Arial" w:hAnsi="Arial"/>
+    </w:rPr>
     <w:tblPr>
       <w:tblStyleRowBandSize w:val="1"/>
       <w:tblStyleColBandSize w:val="1"/>
@@ -4887,6 +4418,9 @@
     <w:pPr>
       <w:spacing w:after="0" w:line="240" w:lineRule="auto"/>
     </w:pPr>
+    <w:rPr>
+      <w:rFonts w:ascii="Arial" w:hAnsi="Arial"/>
+    </w:rPr>
     <w:tblPr>
       <w:tblStyleRowBandSize w:val="1"/>
       <w:tblStyleColBandSize w:val="1"/>
@@ -5017,6 +4551,9 @@
     <w:pPr>
       <w:spacing w:after="0" w:line="240" w:lineRule="auto"/>
     </w:pPr>
+    <w:rPr>
+      <w:rFonts w:ascii="Arial" w:hAnsi="Arial"/>
+    </w:rPr>
     <w:tblPr>
       <w:tblStyleRowBandSize w:val="1"/>
       <w:tblStyleColBandSize w:val="1"/>
@@ -5147,6 +4684,9 @@
     <w:pPr>
       <w:spacing w:after="0" w:line="240" w:lineRule="auto"/>
     </w:pPr>
+    <w:rPr>
+      <w:rFonts w:ascii="Arial" w:hAnsi="Arial"/>
+    </w:rPr>
     <w:tblPr>
       <w:tblStyleRowBandSize w:val="1"/>
       <w:tblStyleColBandSize w:val="1"/>
@@ -5277,6 +4817,9 @@
     <w:pPr>
       <w:spacing w:after="0" w:line="240" w:lineRule="auto"/>
     </w:pPr>
+    <w:rPr>
+      <w:rFonts w:ascii="Arial" w:hAnsi="Arial"/>
+    </w:rPr>
     <w:tblPr>
       <w:tblStyleRowBandSize w:val="1"/>
       <w:tblStyleColBandSize w:val="1"/>
@@ -5383,6 +4926,9 @@
     <w:pPr>
       <w:spacing w:after="0" w:line="240" w:lineRule="auto"/>
     </w:pPr>
+    <w:rPr>
+      <w:rFonts w:ascii="Arial" w:hAnsi="Arial"/>
+    </w:rPr>
     <w:tblPr>
       <w:tblStyleRowBandSize w:val="1"/>
       <w:tblStyleColBandSize w:val="1"/>
@@ -5489,6 +5035,9 @@
     <w:pPr>
       <w:spacing w:after="0" w:line="240" w:lineRule="auto"/>
     </w:pPr>
+    <w:rPr>
+      <w:rFonts w:ascii="Arial" w:hAnsi="Arial"/>
+    </w:rPr>
     <w:tblPr>
       <w:tblStyleRowBandSize w:val="1"/>
       <w:tblStyleColBandSize w:val="1"/>
@@ -5595,6 +5144,9 @@
     <w:pPr>
       <w:spacing w:after="0" w:line="240" w:lineRule="auto"/>
     </w:pPr>
+    <w:rPr>
+      <w:rFonts w:ascii="Arial" w:hAnsi="Arial"/>
+    </w:rPr>
     <w:tblPr>
       <w:tblStyleRowBandSize w:val="1"/>
       <w:tblStyleColBandSize w:val="1"/>
@@ -5701,6 +5253,9 @@
     <w:pPr>
       <w:spacing w:after="0" w:line="240" w:lineRule="auto"/>
     </w:pPr>
+    <w:rPr>
+      <w:rFonts w:ascii="Arial" w:hAnsi="Arial"/>
+    </w:rPr>
     <w:tblPr>
       <w:tblStyleRowBandSize w:val="1"/>
       <w:tblStyleColBandSize w:val="1"/>
@@ -5807,6 +5362,9 @@
     <w:pPr>
       <w:spacing w:after="0" w:line="240" w:lineRule="auto"/>
     </w:pPr>
+    <w:rPr>
+      <w:rFonts w:ascii="Arial" w:hAnsi="Arial"/>
+    </w:rPr>
     <w:tblPr>
       <w:tblStyleRowBandSize w:val="1"/>
       <w:tblStyleColBandSize w:val="1"/>
@@ -5913,6 +5471,9 @@
     <w:pPr>
       <w:spacing w:after="0" w:line="240" w:lineRule="auto"/>
     </w:pPr>
+    <w:rPr>
+      <w:rFonts w:ascii="Arial" w:hAnsi="Arial"/>
+    </w:rPr>
     <w:tblPr>
       <w:tblStyleRowBandSize w:val="1"/>
       <w:tblStyleColBandSize w:val="1"/>
@@ -6019,6 +5580,9 @@
     <w:pPr>
       <w:spacing w:after="0" w:line="240" w:lineRule="auto"/>
     </w:pPr>
+    <w:rPr>
+      <w:rFonts w:ascii="Arial" w:hAnsi="Arial"/>
+    </w:rPr>
     <w:tblPr>
       <w:tblStyleRowBandSize w:val="1"/>
       <w:tblStyleColBandSize w:val="1"/>
@@ -6168,6 +5732,9 @@
     <w:pPr>
       <w:spacing w:after="0" w:line="240" w:lineRule="auto"/>
     </w:pPr>
+    <w:rPr>
+      <w:rFonts w:ascii="Arial" w:hAnsi="Arial"/>
+    </w:rPr>
     <w:tblPr>
       <w:tblStyleRowBandSize w:val="1"/>
       <w:tblStyleColBandSize w:val="1"/>
@@ -6317,6 +5884,9 @@
     <w:pPr>
       <w:spacing w:after="0" w:line="240" w:lineRule="auto"/>
     </w:pPr>
+    <w:rPr>
+      <w:rFonts w:ascii="Arial" w:hAnsi="Arial"/>
+    </w:rPr>
     <w:tblPr>
       <w:tblStyleRowBandSize w:val="1"/>
       <w:tblStyleColBandSize w:val="1"/>
@@ -6466,6 +6036,9 @@
     <w:pPr>
       <w:spacing w:after="0" w:line="240" w:lineRule="auto"/>
     </w:pPr>
+    <w:rPr>
+      <w:rFonts w:ascii="Arial" w:hAnsi="Arial"/>
+    </w:rPr>
     <w:tblPr>
       <w:tblStyleRowBandSize w:val="1"/>
       <w:tblStyleColBandSize w:val="1"/>
@@ -6615,6 +6188,9 @@
     <w:pPr>
       <w:spacing w:after="0" w:line="240" w:lineRule="auto"/>
     </w:pPr>
+    <w:rPr>
+      <w:rFonts w:ascii="Arial" w:hAnsi="Arial"/>
+    </w:rPr>
     <w:tblPr>
       <w:tblStyleRowBandSize w:val="1"/>
       <w:tblStyleColBandSize w:val="1"/>
@@ -6764,6 +6340,9 @@
     <w:pPr>
       <w:spacing w:after="0" w:line="240" w:lineRule="auto"/>
     </w:pPr>
+    <w:rPr>
+      <w:rFonts w:ascii="Arial" w:hAnsi="Arial"/>
+    </w:rPr>
     <w:tblPr>
       <w:tblStyleRowBandSize w:val="1"/>
       <w:tblStyleColBandSize w:val="1"/>
@@ -6913,6 +6492,9 @@
     <w:pPr>
       <w:spacing w:after="0" w:line="240" w:lineRule="auto"/>
     </w:pPr>
+    <w:rPr>
+      <w:rFonts w:ascii="Arial" w:hAnsi="Arial"/>
+    </w:rPr>
     <w:tblPr>
       <w:tblStyleRowBandSize w:val="1"/>
       <w:tblStyleColBandSize w:val="1"/>
@@ -7063,6 +6645,7 @@
       <w:spacing w:after="0" w:line="240" w:lineRule="auto"/>
     </w:pPr>
     <w:rPr>
+      <w:rFonts w:ascii="Arial" w:hAnsi="Arial"/>
       <w:color w:val="000000" w:themeColor="text1"/>
     </w:rPr>
     <w:tblPr>
@@ -7147,6 +6730,7 @@
       <w:spacing w:after="0" w:line="240" w:lineRule="auto"/>
     </w:pPr>
     <w:rPr>
+      <w:rFonts w:ascii="Arial" w:hAnsi="Arial"/>
       <w:color w:val="000000" w:themeColor="text1"/>
     </w:rPr>
     <w:tblPr>
@@ -7231,6 +6815,7 @@
       <w:spacing w:after="0" w:line="240" w:lineRule="auto"/>
     </w:pPr>
     <w:rPr>
+      <w:rFonts w:ascii="Arial" w:hAnsi="Arial"/>
       <w:color w:val="000000" w:themeColor="text1"/>
     </w:rPr>
     <w:tblPr>
@@ -7315,6 +6900,7 @@
       <w:spacing w:after="0" w:line="240" w:lineRule="auto"/>
     </w:pPr>
     <w:rPr>
+      <w:rFonts w:ascii="Arial" w:hAnsi="Arial"/>
       <w:color w:val="000000" w:themeColor="text1"/>
     </w:rPr>
     <w:tblPr>
@@ -7399,6 +6985,7 @@
       <w:spacing w:after="0" w:line="240" w:lineRule="auto"/>
     </w:pPr>
     <w:rPr>
+      <w:rFonts w:ascii="Arial" w:hAnsi="Arial"/>
       <w:color w:val="000000" w:themeColor="text1"/>
     </w:rPr>
     <w:tblPr>
@@ -7483,6 +7070,7 @@
       <w:spacing w:after="0" w:line="240" w:lineRule="auto"/>
     </w:pPr>
     <w:rPr>
+      <w:rFonts w:ascii="Arial" w:hAnsi="Arial"/>
       <w:color w:val="000000" w:themeColor="text1"/>
     </w:rPr>
     <w:tblPr>
@@ -7567,6 +7155,7 @@
       <w:spacing w:after="0" w:line="240" w:lineRule="auto"/>
     </w:pPr>
     <w:rPr>
+      <w:rFonts w:ascii="Arial" w:hAnsi="Arial"/>
       <w:color w:val="000000" w:themeColor="text1"/>
     </w:rPr>
     <w:tblPr>
@@ -7651,7 +7240,7 @@
       <w:spacing w:after="0" w:line="240" w:lineRule="auto"/>
     </w:pPr>
     <w:rPr>
-      <w:rFonts w:asciiTheme="majorHAnsi" w:eastAsiaTheme="majorEastAsia" w:hAnsiTheme="majorHAnsi" w:cstheme="majorBidi"/>
+      <w:rFonts w:asciiTheme="majorHAnsi" w:eastAsiaTheme="majorEastAsia" w:hAnsiTheme="majorHAnsi" w:cstheme="majorBidi" w:ascii="Arial" w:hAnsi="Arial"/>
       <w:color w:val="000000" w:themeColor="text1"/>
     </w:rPr>
     <w:tblPr>
@@ -7779,7 +7368,7 @@
       <w:spacing w:after="0" w:line="240" w:lineRule="auto"/>
     </w:pPr>
     <w:rPr>
-      <w:rFonts w:asciiTheme="majorHAnsi" w:eastAsiaTheme="majorEastAsia" w:hAnsiTheme="majorHAnsi" w:cstheme="majorBidi"/>
+      <w:rFonts w:asciiTheme="majorHAnsi" w:eastAsiaTheme="majorEastAsia" w:hAnsiTheme="majorHAnsi" w:cstheme="majorBidi" w:ascii="Arial" w:hAnsi="Arial"/>
       <w:color w:val="000000" w:themeColor="text1"/>
     </w:rPr>
     <w:tblPr>
@@ -7907,7 +7496,7 @@
       <w:spacing w:after="0" w:line="240" w:lineRule="auto"/>
     </w:pPr>
     <w:rPr>
-      <w:rFonts w:asciiTheme="majorHAnsi" w:eastAsiaTheme="majorEastAsia" w:hAnsiTheme="majorHAnsi" w:cstheme="majorBidi"/>
+      <w:rFonts w:asciiTheme="majorHAnsi" w:eastAsiaTheme="majorEastAsia" w:hAnsiTheme="majorHAnsi" w:cstheme="majorBidi" w:ascii="Arial" w:hAnsi="Arial"/>
       <w:color w:val="000000" w:themeColor="text1"/>
     </w:rPr>
     <w:tblPr>
@@ -8035,7 +7624,7 @@
       <w:spacing w:after="0" w:line="240" w:lineRule="auto"/>
     </w:pPr>
     <w:rPr>
-      <w:rFonts w:asciiTheme="majorHAnsi" w:eastAsiaTheme="majorEastAsia" w:hAnsiTheme="majorHAnsi" w:cstheme="majorBidi"/>
+      <w:rFonts w:asciiTheme="majorHAnsi" w:eastAsiaTheme="majorEastAsia" w:hAnsiTheme="majorHAnsi" w:cstheme="majorBidi" w:ascii="Arial" w:hAnsi="Arial"/>
       <w:color w:val="000000" w:themeColor="text1"/>
     </w:rPr>
     <w:tblPr>
@@ -8163,7 +7752,7 @@
       <w:spacing w:after="0" w:line="240" w:lineRule="auto"/>
     </w:pPr>
     <w:rPr>
-      <w:rFonts w:asciiTheme="majorHAnsi" w:eastAsiaTheme="majorEastAsia" w:hAnsiTheme="majorHAnsi" w:cstheme="majorBidi"/>
+      <w:rFonts w:asciiTheme="majorHAnsi" w:eastAsiaTheme="majorEastAsia" w:hAnsiTheme="majorHAnsi" w:cstheme="majorBidi" w:ascii="Arial" w:hAnsi="Arial"/>
       <w:color w:val="000000" w:themeColor="text1"/>
     </w:rPr>
     <w:tblPr>
@@ -8291,7 +7880,7 @@
       <w:spacing w:after="0" w:line="240" w:lineRule="auto"/>
     </w:pPr>
     <w:rPr>
-      <w:rFonts w:asciiTheme="majorHAnsi" w:eastAsiaTheme="majorEastAsia" w:hAnsiTheme="majorHAnsi" w:cstheme="majorBidi"/>
+      <w:rFonts w:asciiTheme="majorHAnsi" w:eastAsiaTheme="majorEastAsia" w:hAnsiTheme="majorHAnsi" w:cstheme="majorBidi" w:ascii="Arial" w:hAnsi="Arial"/>
       <w:color w:val="000000" w:themeColor="text1"/>
     </w:rPr>
     <w:tblPr>
@@ -8419,7 +8008,7 @@
       <w:spacing w:after="0" w:line="240" w:lineRule="auto"/>
     </w:pPr>
     <w:rPr>
-      <w:rFonts w:asciiTheme="majorHAnsi" w:eastAsiaTheme="majorEastAsia" w:hAnsiTheme="majorHAnsi" w:cstheme="majorBidi"/>
+      <w:rFonts w:asciiTheme="majorHAnsi" w:eastAsiaTheme="majorEastAsia" w:hAnsiTheme="majorHAnsi" w:cstheme="majorBidi" w:ascii="Arial" w:hAnsi="Arial"/>
       <w:color w:val="000000" w:themeColor="text1"/>
     </w:rPr>
     <w:tblPr>
@@ -8546,6 +8135,9 @@
     <w:pPr>
       <w:spacing w:after="0" w:line="240" w:lineRule="auto"/>
     </w:pPr>
+    <w:rPr>
+      <w:rFonts w:ascii="Arial" w:hAnsi="Arial"/>
+    </w:rPr>
     <w:tblPr>
       <w:tblStyleRowBandSize w:val="1"/>
       <w:tblStyleColBandSize w:val="1"/>
@@ -8619,6 +8211,9 @@
     <w:pPr>
       <w:spacing w:after="0" w:line="240" w:lineRule="auto"/>
     </w:pPr>
+    <w:rPr>
+      <w:rFonts w:ascii="Arial" w:hAnsi="Arial"/>
+    </w:rPr>
     <w:tblPr>
       <w:tblStyleRowBandSize w:val="1"/>
       <w:tblStyleColBandSize w:val="1"/>
@@ -8692,6 +8287,9 @@
     <w:pPr>
       <w:spacing w:after="0" w:line="240" w:lineRule="auto"/>
     </w:pPr>
+    <w:rPr>
+      <w:rFonts w:ascii="Arial" w:hAnsi="Arial"/>
+    </w:rPr>
     <w:tblPr>
       <w:tblStyleRowBandSize w:val="1"/>
       <w:tblStyleColBandSize w:val="1"/>
@@ -8765,6 +8363,9 @@
     <w:pPr>
       <w:spacing w:after="0" w:line="240" w:lineRule="auto"/>
     </w:pPr>
+    <w:rPr>
+      <w:rFonts w:ascii="Arial" w:hAnsi="Arial"/>
+    </w:rPr>
     <w:tblPr>
       <w:tblStyleRowBandSize w:val="1"/>
       <w:tblStyleColBandSize w:val="1"/>
@@ -8838,6 +8439,9 @@
     <w:pPr>
       <w:spacing w:after="0" w:line="240" w:lineRule="auto"/>
     </w:pPr>
+    <w:rPr>
+      <w:rFonts w:ascii="Arial" w:hAnsi="Arial"/>
+    </w:rPr>
     <w:tblPr>
       <w:tblStyleRowBandSize w:val="1"/>
       <w:tblStyleColBandSize w:val="1"/>
@@ -8911,6 +8515,9 @@
     <w:pPr>
       <w:spacing w:after="0" w:line="240" w:lineRule="auto"/>
     </w:pPr>
+    <w:rPr>
+      <w:rFonts w:ascii="Arial" w:hAnsi="Arial"/>
+    </w:rPr>
     <w:tblPr>
       <w:tblStyleRowBandSize w:val="1"/>
       <w:tblStyleColBandSize w:val="1"/>
@@ -8984,6 +8591,9 @@
     <w:pPr>
       <w:spacing w:after="0" w:line="240" w:lineRule="auto"/>
     </w:pPr>
+    <w:rPr>
+      <w:rFonts w:ascii="Arial" w:hAnsi="Arial"/>
+    </w:rPr>
     <w:tblPr>
       <w:tblStyleRowBandSize w:val="1"/>
       <w:tblStyleColBandSize w:val="1"/>
@@ -9058,7 +8668,7 @@
       <w:spacing w:after="0" w:line="240" w:lineRule="auto"/>
     </w:pPr>
     <w:rPr>
-      <w:rFonts w:asciiTheme="majorHAnsi" w:eastAsiaTheme="majorEastAsia" w:hAnsiTheme="majorHAnsi" w:cstheme="majorBidi"/>
+      <w:rFonts w:asciiTheme="majorHAnsi" w:eastAsiaTheme="majorEastAsia" w:hAnsiTheme="majorHAnsi" w:cstheme="majorBidi" w:ascii="Arial" w:hAnsi="Arial"/>
       <w:color w:val="000000" w:themeColor="text1"/>
     </w:rPr>
     <w:tblPr>
@@ -9183,7 +8793,7 @@
       <w:spacing w:after="0" w:line="240" w:lineRule="auto"/>
     </w:pPr>
     <w:rPr>
-      <w:rFonts w:asciiTheme="majorHAnsi" w:eastAsiaTheme="majorEastAsia" w:hAnsiTheme="majorHAnsi" w:cstheme="majorBidi"/>
+      <w:rFonts w:asciiTheme="majorHAnsi" w:eastAsiaTheme="majorEastAsia" w:hAnsiTheme="majorHAnsi" w:cstheme="majorBidi" w:ascii="Arial" w:hAnsi="Arial"/>
       <w:color w:val="000000" w:themeColor="text1"/>
     </w:rPr>
     <w:tblPr>
@@ -9308,7 +8918,7 @@
       <w:spacing w:after="0" w:line="240" w:lineRule="auto"/>
     </w:pPr>
     <w:rPr>
-      <w:rFonts w:asciiTheme="majorHAnsi" w:eastAsiaTheme="majorEastAsia" w:hAnsiTheme="majorHAnsi" w:cstheme="majorBidi"/>
+      <w:rFonts w:asciiTheme="majorHAnsi" w:eastAsiaTheme="majorEastAsia" w:hAnsiTheme="majorHAnsi" w:cstheme="majorBidi" w:ascii="Arial" w:hAnsi="Arial"/>
       <w:color w:val="000000" w:themeColor="text1"/>
     </w:rPr>
     <w:tblPr>
@@ -9433,7 +9043,7 @@
       <w:spacing w:after="0" w:line="240" w:lineRule="auto"/>
     </w:pPr>
     <w:rPr>
-      <w:rFonts w:asciiTheme="majorHAnsi" w:eastAsiaTheme="majorEastAsia" w:hAnsiTheme="majorHAnsi" w:cstheme="majorBidi"/>
+      <w:rFonts w:asciiTheme="majorHAnsi" w:eastAsiaTheme="majorEastAsia" w:hAnsiTheme="majorHAnsi" w:cstheme="majorBidi" w:ascii="Arial" w:hAnsi="Arial"/>
       <w:color w:val="000000" w:themeColor="text1"/>
     </w:rPr>
     <w:tblPr>
@@ -9558,7 +9168,7 @@
       <w:spacing w:after="0" w:line="240" w:lineRule="auto"/>
     </w:pPr>
     <w:rPr>
-      <w:rFonts w:asciiTheme="majorHAnsi" w:eastAsiaTheme="majorEastAsia" w:hAnsiTheme="majorHAnsi" w:cstheme="majorBidi"/>
+      <w:rFonts w:asciiTheme="majorHAnsi" w:eastAsiaTheme="majorEastAsia" w:hAnsiTheme="majorHAnsi" w:cstheme="majorBidi" w:ascii="Arial" w:hAnsi="Arial"/>
       <w:color w:val="000000" w:themeColor="text1"/>
     </w:rPr>
     <w:tblPr>
@@ -9683,7 +9293,7 @@
       <w:spacing w:after="0" w:line="240" w:lineRule="auto"/>
     </w:pPr>
     <w:rPr>
-      <w:rFonts w:asciiTheme="majorHAnsi" w:eastAsiaTheme="majorEastAsia" w:hAnsiTheme="majorHAnsi" w:cstheme="majorBidi"/>
+      <w:rFonts w:asciiTheme="majorHAnsi" w:eastAsiaTheme="majorEastAsia" w:hAnsiTheme="majorHAnsi" w:cstheme="majorBidi" w:ascii="Arial" w:hAnsi="Arial"/>
       <w:color w:val="000000" w:themeColor="text1"/>
     </w:rPr>
     <w:tblPr>
@@ -9808,7 +9418,7 @@
       <w:spacing w:after="0" w:line="240" w:lineRule="auto"/>
     </w:pPr>
     <w:rPr>
-      <w:rFonts w:asciiTheme="majorHAnsi" w:eastAsiaTheme="majorEastAsia" w:hAnsiTheme="majorHAnsi" w:cstheme="majorBidi"/>
+      <w:rFonts w:asciiTheme="majorHAnsi" w:eastAsiaTheme="majorEastAsia" w:hAnsiTheme="majorHAnsi" w:cstheme="majorBidi" w:ascii="Arial" w:hAnsi="Arial"/>
       <w:color w:val="000000" w:themeColor="text1"/>
     </w:rPr>
     <w:tblPr>
@@ -9932,6 +9542,9 @@
     <w:pPr>
       <w:spacing w:after="0" w:line="240" w:lineRule="auto"/>
     </w:pPr>
+    <w:rPr>
+      <w:rFonts w:ascii="Arial" w:hAnsi="Arial"/>
+    </w:rPr>
     <w:tblPr>
       <w:tblStyleRowBandSize w:val="1"/>
       <w:tblStyleColBandSize w:val="1"/>
@@ -10073,6 +9686,9 @@
     <w:pPr>
       <w:spacing w:after="0" w:line="240" w:lineRule="auto"/>
     </w:pPr>
+    <w:rPr>
+      <w:rFonts w:ascii="Arial" w:hAnsi="Arial"/>
+    </w:rPr>
     <w:tblPr>
       <w:tblStyleRowBandSize w:val="1"/>
       <w:tblStyleColBandSize w:val="1"/>
@@ -10214,6 +9830,9 @@
     <w:pPr>
       <w:spacing w:after="0" w:line="240" w:lineRule="auto"/>
     </w:pPr>
+    <w:rPr>
+      <w:rFonts w:ascii="Arial" w:hAnsi="Arial"/>
+    </w:rPr>
     <w:tblPr>
       <w:tblStyleRowBandSize w:val="1"/>
       <w:tblStyleColBandSize w:val="1"/>
@@ -10355,6 +9974,9 @@
     <w:pPr>
       <w:spacing w:after="0" w:line="240" w:lineRule="auto"/>
     </w:pPr>
+    <w:rPr>
+      <w:rFonts w:ascii="Arial" w:hAnsi="Arial"/>
+    </w:rPr>
     <w:tblPr>
       <w:tblStyleRowBandSize w:val="1"/>
       <w:tblStyleColBandSize w:val="1"/>
@@ -10496,6 +10118,9 @@
     <w:pPr>
       <w:spacing w:after="0" w:line="240" w:lineRule="auto"/>
     </w:pPr>
+    <w:rPr>
+      <w:rFonts w:ascii="Arial" w:hAnsi="Arial"/>
+    </w:rPr>
     <w:tblPr>
       <w:tblStyleRowBandSize w:val="1"/>
       <w:tblStyleColBandSize w:val="1"/>
@@ -10637,6 +10262,9 @@
     <w:pPr>
       <w:spacing w:after="0" w:line="240" w:lineRule="auto"/>
     </w:pPr>
+    <w:rPr>
+      <w:rFonts w:ascii="Arial" w:hAnsi="Arial"/>
+    </w:rPr>
     <w:tblPr>
       <w:tblStyleRowBandSize w:val="1"/>
       <w:tblStyleColBandSize w:val="1"/>
@@ -10778,6 +10406,9 @@
     <w:pPr>
       <w:spacing w:after="0" w:line="240" w:lineRule="auto"/>
     </w:pPr>
+    <w:rPr>
+      <w:rFonts w:ascii="Arial" w:hAnsi="Arial"/>
+    </w:rPr>
     <w:tblPr>
       <w:tblStyleRowBandSize w:val="1"/>
       <w:tblStyleColBandSize w:val="1"/>
@@ -10920,6 +10551,7 @@
       <w:spacing w:after="0" w:line="240" w:lineRule="auto"/>
     </w:pPr>
     <w:rPr>
+      <w:rFonts w:ascii="Arial" w:hAnsi="Arial"/>
       <w:color w:val="FFFFFF" w:themeColor="background1"/>
     </w:rPr>
     <w:tblPr>
@@ -11034,6 +10666,7 @@
       <w:spacing w:after="0" w:line="240" w:lineRule="auto"/>
     </w:pPr>
     <w:rPr>
+      <w:rFonts w:ascii="Arial" w:hAnsi="Arial"/>
       <w:color w:val="FFFFFF" w:themeColor="background1"/>
     </w:rPr>
     <w:tblPr>
@@ -11148,6 +10781,7 @@
       <w:spacing w:after="0" w:line="240" w:lineRule="auto"/>
     </w:pPr>
     <w:rPr>
+      <w:rFonts w:ascii="Arial" w:hAnsi="Arial"/>
       <w:color w:val="FFFFFF" w:themeColor="background1"/>
     </w:rPr>
     <w:tblPr>
@@ -11262,6 +10896,7 @@
       <w:spacing w:after="0" w:line="240" w:lineRule="auto"/>
     </w:pPr>
     <w:rPr>
+      <w:rFonts w:ascii="Arial" w:hAnsi="Arial"/>
       <w:color w:val="FFFFFF" w:themeColor="background1"/>
     </w:rPr>
     <w:tblPr>
@@ -11376,6 +11011,7 @@
       <w:spacing w:after="0" w:line="240" w:lineRule="auto"/>
     </w:pPr>
     <w:rPr>
+      <w:rFonts w:ascii="Arial" w:hAnsi="Arial"/>
       <w:color w:val="FFFFFF" w:themeColor="background1"/>
     </w:rPr>
     <w:tblPr>
@@ -11490,6 +11126,7 @@
       <w:spacing w:after="0" w:line="240" w:lineRule="auto"/>
     </w:pPr>
     <w:rPr>
+      <w:rFonts w:ascii="Arial" w:hAnsi="Arial"/>
       <w:color w:val="FFFFFF" w:themeColor="background1"/>
     </w:rPr>
     <w:tblPr>
@@ -11604,6 +11241,7 @@
       <w:spacing w:after="0" w:line="240" w:lineRule="auto"/>
     </w:pPr>
     <w:rPr>
+      <w:rFonts w:ascii="Arial" w:hAnsi="Arial"/>
       <w:color w:val="FFFFFF" w:themeColor="background1"/>
     </w:rPr>
     <w:tblPr>
@@ -11718,6 +11356,7 @@
       <w:spacing w:after="0" w:line="240" w:lineRule="auto"/>
     </w:pPr>
     <w:rPr>
+      <w:rFonts w:ascii="Arial" w:hAnsi="Arial"/>
       <w:color w:val="000000" w:themeColor="text1"/>
     </w:rPr>
     <w:tblPr>
@@ -11840,6 +11479,7 @@
       <w:spacing w:after="0" w:line="240" w:lineRule="auto"/>
     </w:pPr>
     <w:rPr>
+      <w:rFonts w:ascii="Arial" w:hAnsi="Arial"/>
       <w:color w:val="000000" w:themeColor="text1"/>
     </w:rPr>
     <w:tblPr>
@@ -11962,6 +11602,7 @@
       <w:spacing w:after="0" w:line="240" w:lineRule="auto"/>
     </w:pPr>
     <w:rPr>
+      <w:rFonts w:ascii="Arial" w:hAnsi="Arial"/>
       <w:color w:val="000000" w:themeColor="text1"/>
     </w:rPr>
     <w:tblPr>
@@ -12084,6 +11725,7 @@
       <w:spacing w:after="0" w:line="240" w:lineRule="auto"/>
     </w:pPr>
     <w:rPr>
+      <w:rFonts w:ascii="Arial" w:hAnsi="Arial"/>
       <w:color w:val="000000" w:themeColor="text1"/>
     </w:rPr>
     <w:tblPr>
@@ -12196,6 +11838,7 @@
       <w:spacing w:after="0" w:line="240" w:lineRule="auto"/>
     </w:pPr>
     <w:rPr>
+      <w:rFonts w:ascii="Arial" w:hAnsi="Arial"/>
       <w:color w:val="000000" w:themeColor="text1"/>
     </w:rPr>
     <w:tblPr>
@@ -12318,6 +11961,7 @@
       <w:spacing w:after="0" w:line="240" w:lineRule="auto"/>
     </w:pPr>
     <w:rPr>
+      <w:rFonts w:ascii="Arial" w:hAnsi="Arial"/>
       <w:color w:val="000000" w:themeColor="text1"/>
     </w:rPr>
     <w:tblPr>
@@ -12440,6 +12084,7 @@
       <w:spacing w:after="0" w:line="240" w:lineRule="auto"/>
     </w:pPr>
     <w:rPr>
+      <w:rFonts w:ascii="Arial" w:hAnsi="Arial"/>
       <w:color w:val="000000" w:themeColor="text1"/>
     </w:rPr>
     <w:tblPr>
@@ -12562,6 +12207,7 @@
       <w:spacing w:after="0" w:line="240" w:lineRule="auto"/>
     </w:pPr>
     <w:rPr>
+      <w:rFonts w:ascii="Arial" w:hAnsi="Arial"/>
       <w:color w:val="000000" w:themeColor="text1"/>
     </w:rPr>
     <w:tblPr>
@@ -12648,6 +12294,7 @@
       <w:spacing w:after="0" w:line="240" w:lineRule="auto"/>
     </w:pPr>
     <w:rPr>
+      <w:rFonts w:ascii="Arial" w:hAnsi="Arial"/>
       <w:color w:val="000000" w:themeColor="text1"/>
     </w:rPr>
     <w:tblPr>
@@ -12734,6 +12381,7 @@
       <w:spacing w:after="0" w:line="240" w:lineRule="auto"/>
     </w:pPr>
     <w:rPr>
+      <w:rFonts w:ascii="Arial" w:hAnsi="Arial"/>
       <w:color w:val="000000" w:themeColor="text1"/>
     </w:rPr>
     <w:tblPr>
@@ -12820,6 +12468,7 @@
       <w:spacing w:after="0" w:line="240" w:lineRule="auto"/>
     </w:pPr>
     <w:rPr>
+      <w:rFonts w:ascii="Arial" w:hAnsi="Arial"/>
       <w:color w:val="000000" w:themeColor="text1"/>
     </w:rPr>
     <w:tblPr>
@@ -12906,6 +12555,7 @@
       <w:spacing w:after="0" w:line="240" w:lineRule="auto"/>
     </w:pPr>
     <w:rPr>
+      <w:rFonts w:ascii="Arial" w:hAnsi="Arial"/>
       <w:color w:val="000000" w:themeColor="text1"/>
     </w:rPr>
     <w:tblPr>
@@ -12992,6 +12642,7 @@
       <w:spacing w:after="0" w:line="240" w:lineRule="auto"/>
     </w:pPr>
     <w:rPr>
+      <w:rFonts w:ascii="Arial" w:hAnsi="Arial"/>
       <w:color w:val="000000" w:themeColor="text1"/>
     </w:rPr>
     <w:tblPr>
@@ -13078,6 +12729,7 @@
       <w:spacing w:after="0" w:line="240" w:lineRule="auto"/>
     </w:pPr>
     <w:rPr>
+      <w:rFonts w:ascii="Arial" w:hAnsi="Arial"/>
       <w:color w:val="000000" w:themeColor="text1"/>
     </w:rPr>
     <w:tblPr>
@@ -13164,6 +12816,7 @@
       <w:spacing w:after="0" w:line="240" w:lineRule="auto"/>
     </w:pPr>
     <w:rPr>
+      <w:rFonts w:ascii="Arial" w:hAnsi="Arial"/>
       <w:color w:val="000000" w:themeColor="text1"/>
     </w:rPr>
     <w:tblPr>
@@ -13244,6 +12897,7 @@
       <w:spacing w:after="0" w:line="240" w:lineRule="auto"/>
     </w:pPr>
     <w:rPr>
+      <w:rFonts w:ascii="Arial" w:hAnsi="Arial"/>
       <w:color w:val="000000" w:themeColor="text1"/>
     </w:rPr>
     <w:tblPr>
@@ -13324,6 +12978,7 @@
       <w:spacing w:after="0" w:line="240" w:lineRule="auto"/>
     </w:pPr>
     <w:rPr>
+      <w:rFonts w:ascii="Arial" w:hAnsi="Arial"/>
       <w:color w:val="000000" w:themeColor="text1"/>
     </w:rPr>
     <w:tblPr>
@@ -13404,6 +13059,7 @@
       <w:spacing w:after="0" w:line="240" w:lineRule="auto"/>
     </w:pPr>
     <w:rPr>
+      <w:rFonts w:ascii="Arial" w:hAnsi="Arial"/>
       <w:color w:val="000000" w:themeColor="text1"/>
     </w:rPr>
     <w:tblPr>
@@ -13484,6 +13140,7 @@
       <w:spacing w:after="0" w:line="240" w:lineRule="auto"/>
     </w:pPr>
     <w:rPr>
+      <w:rFonts w:ascii="Arial" w:hAnsi="Arial"/>
       <w:color w:val="000000" w:themeColor="text1"/>
     </w:rPr>
     <w:tblPr>
@@ -13564,6 +13221,7 @@
       <w:spacing w:after="0" w:line="240" w:lineRule="auto"/>
     </w:pPr>
     <w:rPr>
+      <w:rFonts w:ascii="Arial" w:hAnsi="Arial"/>
       <w:color w:val="000000" w:themeColor="text1"/>
     </w:rPr>
     <w:tblPr>
@@ -13644,6 +13302,7 @@
       <w:spacing w:after="0" w:line="240" w:lineRule="auto"/>
     </w:pPr>
     <w:rPr>
+      <w:rFonts w:ascii="Arial" w:hAnsi="Arial"/>
       <w:color w:val="000000" w:themeColor="text1"/>
     </w:rPr>
     <w:tblPr>

</xml_diff>